<commit_message>
Annotation of the Training code and dataset link
</commit_message>
<xml_diff>
--- a/Documentation/On the possibility of a morally sound LLM.docx
+++ b/Documentation/On the possibility of a morally sound LLM.docx
@@ -569,6 +569,7 @@
         </w:rPr>
         <w:t xml:space="preserve">not to follow its command) or </w:t>
       </w:r>
+      <w:proofErr w:type="spellStart"/>
       <w:r>
         <w:rPr>
           <w:i/>
@@ -579,6 +580,7 @@
         </w:rPr>
         <w:t>impositive</w:t>
       </w:r>
+      <w:proofErr w:type="spellEnd"/>
       <w:r>
         <w:rPr>
           <w:sz w:val="22"/>
@@ -685,13 +687,23 @@
           <w:lang w:val="en-GB"/>
         </w:rPr>
       </w:pPr>
+      <w:proofErr w:type="spellStart"/>
       <w:r>
         <w:rPr>
           <w:rFonts w:ascii="Arial" w:hAnsi="Arial" w:cs="Arial"/>
           <w:sz w:val="16"/>
           <w:szCs w:val="16"/>
         </w:rPr>
-        <w:t xml:space="preserve">Figure </w:t>
+        <w:t>Figure</w:t>
+      </w:r>
+      <w:proofErr w:type="spellEnd"/>
+      <w:r>
+        <w:rPr>
+          <w:rFonts w:ascii="Arial" w:hAnsi="Arial" w:cs="Arial"/>
+          <w:sz w:val="16"/>
+          <w:szCs w:val="16"/>
+        </w:rPr>
+        <w:t xml:space="preserve"> </w:t>
       </w:r>
       <w:r>
         <w:rPr>
@@ -740,8 +752,36 @@
           <w:sz w:val="16"/>
           <w:szCs w:val="16"/>
         </w:rPr>
-        <w:t>. Classification of laws</w:t>
-      </w:r>
+        <w:t xml:space="preserve">. </w:t>
+      </w:r>
+      <w:proofErr w:type="spellStart"/>
+      <w:r>
+        <w:rPr>
+          <w:rFonts w:ascii="Arial" w:hAnsi="Arial" w:cs="Arial"/>
+          <w:sz w:val="16"/>
+          <w:szCs w:val="16"/>
+        </w:rPr>
+        <w:t>Classification</w:t>
+      </w:r>
+      <w:proofErr w:type="spellEnd"/>
+      <w:r>
+        <w:rPr>
+          <w:rFonts w:ascii="Arial" w:hAnsi="Arial" w:cs="Arial"/>
+          <w:sz w:val="16"/>
+          <w:szCs w:val="16"/>
+        </w:rPr>
+        <w:t xml:space="preserve"> of </w:t>
+      </w:r>
+      <w:proofErr w:type="spellStart"/>
+      <w:r>
+        <w:rPr>
+          <w:rFonts w:ascii="Arial" w:hAnsi="Arial" w:cs="Arial"/>
+          <w:sz w:val="16"/>
+          <w:szCs w:val="16"/>
+        </w:rPr>
+        <w:t>laws</w:t>
+      </w:r>
+      <w:proofErr w:type="spellEnd"/>
     </w:p>
     <w:p>
       <w:pPr>
@@ -957,7 +997,25 @@
           <w:szCs w:val="20"/>
           <w:lang w:val="en-GB"/>
         </w:rPr>
-        <w:t xml:space="preserve"> (a favourable or disfavourable </w:t>
+        <w:t xml:space="preserve"> (a favourable or </w:t>
+      </w:r>
+      <w:proofErr w:type="spellStart"/>
+      <w:r>
+        <w:rPr>
+          <w:sz w:val="22"/>
+          <w:szCs w:val="20"/>
+          <w:lang w:val="en-GB"/>
+        </w:rPr>
+        <w:t>disfavourable</w:t>
+      </w:r>
+      <w:proofErr w:type="spellEnd"/>
+      <w:r>
+        <w:rPr>
+          <w:sz w:val="22"/>
+          <w:szCs w:val="20"/>
+          <w:lang w:val="en-GB"/>
+        </w:rPr>
+        <w:t xml:space="preserve"> </w:t>
       </w:r>
       <w:r>
         <w:rPr>
@@ -1208,13 +1266,23 @@
           <w:szCs w:val="16"/>
         </w:rPr>
       </w:pPr>
+      <w:proofErr w:type="spellStart"/>
       <w:r>
         <w:rPr>
           <w:rFonts w:ascii="Arial" w:hAnsi="Arial" w:cs="Arial"/>
           <w:sz w:val="16"/>
           <w:szCs w:val="16"/>
         </w:rPr>
-        <w:t xml:space="preserve">Figure </w:t>
+        <w:t>Figure</w:t>
+      </w:r>
+      <w:proofErr w:type="spellEnd"/>
+      <w:r>
+        <w:rPr>
+          <w:rFonts w:ascii="Arial" w:hAnsi="Arial" w:cs="Arial"/>
+          <w:sz w:val="16"/>
+          <w:szCs w:val="16"/>
+        </w:rPr>
+        <w:t xml:space="preserve"> </w:t>
       </w:r>
       <w:r>
         <w:rPr>
@@ -1263,7 +1331,25 @@
           <w:sz w:val="16"/>
           <w:szCs w:val="16"/>
         </w:rPr>
-        <w:t xml:space="preserve">. Classification of </w:t>
+        <w:t xml:space="preserve">. </w:t>
+      </w:r>
+      <w:proofErr w:type="spellStart"/>
+      <w:r>
+        <w:rPr>
+          <w:rFonts w:ascii="Arial" w:hAnsi="Arial" w:cs="Arial"/>
+          <w:sz w:val="16"/>
+          <w:szCs w:val="16"/>
+        </w:rPr>
+        <w:t>Classification</w:t>
+      </w:r>
+      <w:proofErr w:type="spellEnd"/>
+      <w:r>
+        <w:rPr>
+          <w:rFonts w:ascii="Arial" w:hAnsi="Arial" w:cs="Arial"/>
+          <w:sz w:val="16"/>
+          <w:szCs w:val="16"/>
+        </w:rPr>
+        <w:t xml:space="preserve"> of </w:t>
       </w:r>
       <w:r>
         <w:rPr>
@@ -1608,7 +1694,25 @@
           <w:szCs w:val="20"/>
           <w:lang w:val="en-GB"/>
         </w:rPr>
-        <w:t xml:space="preserve">defends that moral laws are universal (in that they apply to every human being, everywhere and anytime) and objective (so they are independent from any particular consideration, </w:t>
+        <w:t xml:space="preserve">defends that moral laws are universal (in that they apply to every human being, everywhere and anytime) and objective (so they are independent from any </w:t>
+      </w:r>
+      <w:proofErr w:type="gramStart"/>
+      <w:r>
+        <w:rPr>
+          <w:sz w:val="22"/>
+          <w:szCs w:val="20"/>
+          <w:lang w:val="en-GB"/>
+        </w:rPr>
+        <w:t>particular consideration</w:t>
+      </w:r>
+      <w:proofErr w:type="gramEnd"/>
+      <w:r>
+        <w:rPr>
+          <w:sz w:val="22"/>
+          <w:szCs w:val="20"/>
+          <w:lang w:val="en-GB"/>
+        </w:rPr>
+        <w:t xml:space="preserve">, </w:t>
       </w:r>
       <w:r>
         <w:rPr>
@@ -3673,8 +3777,18 @@
           <w:szCs w:val="20"/>
           <w:lang w:val="en-GB"/>
         </w:rPr>
-        <w:t>In AI, is this not the same as in absolutism? In that the rule is to follow until it cannot be followed, without ever breaking the tenth?</w:t>
-      </w:r>
+        <w:t xml:space="preserve">In AI, is this not the same as in absolutism? In that the rule is to follow until it cannot be followed, without ever breaking the </w:t>
+      </w:r>
+      <w:proofErr w:type="gramStart"/>
+      <w:r>
+        <w:rPr>
+          <w:sz w:val="22"/>
+          <w:szCs w:val="20"/>
+          <w:lang w:val="en-GB"/>
+        </w:rPr>
+        <w:t>tenth?</w:t>
+      </w:r>
+      <w:proofErr w:type="gramEnd"/>
     </w:p>
     <w:p>
       <w:pPr>

</xml_diff>

<commit_message>
Cleanup, schools of thought and limitations
</commit_message>
<xml_diff>
--- a/Documentation/On the possibility of a morally sound LLM.docx
+++ b/Documentation/On the possibility of a morally sound LLM.docx
@@ -1694,25 +1694,7 @@
           <w:szCs w:val="20"/>
           <w:lang w:val="en-GB"/>
         </w:rPr>
-        <w:t xml:space="preserve">defends that moral laws are universal (in that they apply to every human being, everywhere and anytime) and objective (so they are independent from any </w:t>
-      </w:r>
-      <w:proofErr w:type="gramStart"/>
-      <w:r>
-        <w:rPr>
-          <w:sz w:val="22"/>
-          <w:szCs w:val="20"/>
-          <w:lang w:val="en-GB"/>
-        </w:rPr>
-        <w:t>particular consideration</w:t>
-      </w:r>
-      <w:proofErr w:type="gramEnd"/>
-      <w:r>
-        <w:rPr>
-          <w:sz w:val="22"/>
-          <w:szCs w:val="20"/>
-          <w:lang w:val="en-GB"/>
-        </w:rPr>
-        <w:t xml:space="preserve">, </w:t>
+        <w:t xml:space="preserve">defends that moral laws are universal (in that they apply to every human being, everywhere and anytime) and objective (so they are independent from any particular consideration, </w:t>
       </w:r>
       <w:r>
         <w:rPr>
@@ -2641,6 +2623,10 @@
     <w:p>
       <w:pPr>
         <w:pStyle w:val="Narracions"/>
+        <w:numPr>
+          <w:ilvl w:val="0"/>
+          <w:numId w:val="4"/>
+        </w:numPr>
         <w:rPr>
           <w:sz w:val="22"/>
           <w:szCs w:val="20"/>
@@ -2680,11 +2666,79 @@
           <w:lang w:val="en-GB"/>
         </w:rPr>
         <w:t>correct</w:t>
+      </w:r>
+      <w:r>
+        <w:rPr>
+          <w:sz w:val="22"/>
+          <w:szCs w:val="20"/>
+          <w:lang w:val="en-GB"/>
+        </w:rPr>
+        <w:t xml:space="preserve"> subjective </w:t>
+      </w:r>
+      <w:r>
+        <w:rPr>
+          <w:sz w:val="22"/>
+          <w:szCs w:val="20"/>
+          <w:lang w:val="en-GB"/>
+        </w:rPr>
+        <w:t xml:space="preserve">manifestation of its formulation. It </w:t>
+      </w:r>
+      <w:r>
+        <w:rPr>
+          <w:sz w:val="22"/>
+          <w:szCs w:val="20"/>
+          <w:lang w:val="en-GB"/>
+        </w:rPr>
+        <w:t xml:space="preserve">argues that it may also be the case that the law is bound the circumstances of its application. It opposes </w:t>
+      </w:r>
+      <w:r>
+        <w:rPr>
+          <w:sz w:val="22"/>
+          <w:szCs w:val="20"/>
+          <w:lang w:val="en-GB"/>
+        </w:rPr>
+        <w:t xml:space="preserve">moral absolutism, as it defends that morality is not universal and, alternatively, holds that </w:t>
+      </w:r>
+      <w:r>
+        <w:rPr>
+          <w:sz w:val="22"/>
+          <w:szCs w:val="20"/>
+          <w:lang w:val="en-GB"/>
+        </w:rPr>
+        <w:t xml:space="preserve">moral laws are dependant on its time, culture, or group. Moral laws are, in fact, </w:t>
+      </w:r>
+      <w:r>
+        <w:rPr>
+          <w:sz w:val="22"/>
+          <w:szCs w:val="20"/>
+          <w:lang w:val="en-GB"/>
+        </w:rPr>
+        <w:t xml:space="preserve">validated by the group. Such relativism </w:t>
+      </w:r>
+      <w:r>
+        <w:rPr>
+          <w:sz w:val="22"/>
+          <w:szCs w:val="20"/>
+          <w:lang w:val="en-GB"/>
+        </w:rPr>
+        <w:t>forbids different groups from judging the moral laws of others</w:t>
+      </w:r>
+      <w:r>
+        <w:rPr>
+          <w:sz w:val="22"/>
+          <w:szCs w:val="20"/>
+          <w:lang w:val="en-GB"/>
+        </w:rPr>
+        <w:t>, which severely complicates the coexistence in plural societies.</w:t>
       </w:r>
     </w:p>
     <w:p>
       <w:pPr>
         <w:pStyle w:val="Narracions"/>
+        <w:numPr>
+          <w:ilvl w:val="0"/>
+          <w:numId w:val="4"/>
+        </w:numPr>
         <w:rPr>
           <w:sz w:val="22"/>
           <w:szCs w:val="20"/>
@@ -2708,6 +2762,142 @@
           <w:lang w:val="en-GB"/>
         </w:rPr>
         <w:t xml:space="preserve"> is</w:t>
+      </w:r>
+      <w:r>
+        <w:rPr>
+          <w:sz w:val="22"/>
+          <w:szCs w:val="20"/>
+          <w:lang w:val="en-GB"/>
+        </w:rPr>
+        <w:t xml:space="preserve"> an extreme form of moral relativism. Just as moral relativism did, it opposes moral absolutism.</w:t>
+      </w:r>
+      <w:r>
+        <w:rPr>
+          <w:sz w:val="22"/>
+          <w:szCs w:val="20"/>
+          <w:lang w:val="en-GB"/>
+        </w:rPr>
+        <w:t xml:space="preserve"> It </w:t>
+      </w:r>
+      <w:r>
+        <w:rPr>
+          <w:sz w:val="22"/>
+          <w:szCs w:val="20"/>
+          <w:lang w:val="en-GB"/>
+        </w:rPr>
+        <w:t xml:space="preserve">argues that the subject’s </w:t>
+      </w:r>
+      <w:r>
+        <w:rPr>
+          <w:sz w:val="22"/>
+          <w:szCs w:val="20"/>
+          <w:lang w:val="en-GB"/>
+        </w:rPr>
+        <w:t>judgement is the foundation or limit for morality.</w:t>
+      </w:r>
+      <w:r>
+        <w:rPr>
+          <w:sz w:val="22"/>
+          <w:szCs w:val="20"/>
+          <w:lang w:val="en-GB"/>
+        </w:rPr>
+        <w:t xml:space="preserve"> It is grounded on affection</w:t>
+      </w:r>
+      <w:r>
+        <w:rPr>
+          <w:sz w:val="22"/>
+          <w:szCs w:val="20"/>
+          <w:lang w:val="en-GB"/>
+        </w:rPr>
+        <w:t xml:space="preserve"> and coherence, as </w:t>
+      </w:r>
+      <w:r>
+        <w:rPr>
+          <w:sz w:val="22"/>
+          <w:szCs w:val="20"/>
+          <w:lang w:val="en-GB"/>
+        </w:rPr>
+        <w:t xml:space="preserve">it is the consistency between what the subject does and their personal values what </w:t>
+      </w:r>
+      <w:r>
+        <w:rPr>
+          <w:sz w:val="22"/>
+          <w:szCs w:val="20"/>
+          <w:lang w:val="en-GB"/>
+        </w:rPr>
+        <w:t>gives their morality validity. Jean</w:t>
+      </w:r>
+      <w:r>
+        <w:rPr>
+          <w:sz w:val="22"/>
+          <w:szCs w:val="20"/>
+          <w:lang w:val="en-GB"/>
+        </w:rPr>
+        <w:t>-Paul Sartre would be a representative of moral subjectivism.</w:t>
+      </w:r>
+    </w:p>
+    <w:p>
+      <w:pPr>
+        <w:pStyle w:val="Narracions"/>
+        <w:numPr>
+          <w:ilvl w:val="0"/>
+          <w:numId w:val="4"/>
+        </w:numPr>
+        <w:rPr>
+          <w:sz w:val="22"/>
+          <w:szCs w:val="20"/>
+          <w:lang w:val="en-GB"/>
+        </w:rPr>
+      </w:pPr>
+      <w:r>
+        <w:rPr>
+          <w:b/>
+          <w:bCs/>
+          <w:sz w:val="22"/>
+          <w:szCs w:val="20"/>
+          <w:lang w:val="en-GB"/>
+        </w:rPr>
+        <w:t>Moral nihilism</w:t>
+      </w:r>
+      <w:r>
+        <w:rPr>
+          <w:sz w:val="22"/>
+          <w:szCs w:val="20"/>
+          <w:lang w:val="en-GB"/>
+        </w:rPr>
+        <w:t xml:space="preserve"> an extreme form of moral subjectivism</w:t>
+      </w:r>
+      <w:r>
+        <w:rPr>
+          <w:sz w:val="22"/>
+          <w:szCs w:val="20"/>
+          <w:lang w:val="en-GB"/>
+        </w:rPr>
+        <w:t xml:space="preserve">. It </w:t>
+      </w:r>
+      <w:r>
+        <w:rPr>
+          <w:sz w:val="22"/>
+          <w:szCs w:val="20"/>
+          <w:lang w:val="en-GB"/>
+        </w:rPr>
+        <w:t>denies the existence of objective moral truths</w:t>
+      </w:r>
+      <w:r>
+        <w:rPr>
+          <w:sz w:val="22"/>
+          <w:szCs w:val="20"/>
+          <w:lang w:val="en-GB"/>
+        </w:rPr>
+        <w:t xml:space="preserve">. Although it allows for altruism or willingness to do no harm to others, it does so without </w:t>
+      </w:r>
+      <w:r>
+        <w:rPr>
+          <w:sz w:val="22"/>
+          <w:szCs w:val="20"/>
+          <w:lang w:val="en-GB"/>
+        </w:rPr>
+        <w:t>believing in said truths.</w:t>
       </w:r>
     </w:p>
     <w:p>
@@ -2936,7 +3126,23 @@
           <w:szCs w:val="20"/>
           <w:lang w:val="en-GB"/>
         </w:rPr>
-        <w:t xml:space="preserve"> from the authors </w:t>
+        <w:t xml:space="preserve"> from the authors</w:t>
+      </w:r>
+      <w:r>
+        <w:rPr>
+          <w:sz w:val="22"/>
+          <w:szCs w:val="20"/>
+          <w:lang w:val="en-GB"/>
+        </w:rPr>
+        <w:t xml:space="preserve"> (or the dataset)</w:t>
+      </w:r>
+      <w:r>
+        <w:rPr>
+          <w:sz w:val="22"/>
+          <w:szCs w:val="20"/>
+          <w:lang w:val="en-GB"/>
+        </w:rPr>
+        <w:t xml:space="preserve"> </w:t>
       </w:r>
       <w:r>
         <w:rPr>
@@ -3128,7 +3334,16 @@
           <w:szCs w:val="20"/>
           <w:lang w:val="en-GB"/>
         </w:rPr>
-        <w:t xml:space="preserve">it is unlikely that it would be </w:t>
+        <w:t xml:space="preserve">it is unlikely that it </w:t>
+      </w:r>
+      <w:r>
+        <w:rPr>
+          <w:sz w:val="22"/>
+          <w:szCs w:val="20"/>
+          <w:lang w:val="en-GB"/>
+        </w:rPr>
+        <w:lastRenderedPageBreak/>
+        <w:t xml:space="preserve">would be </w:t>
       </w:r>
       <w:r>
         <w:rPr>
@@ -3301,6 +3516,133 @@
       <w:pPr>
         <w:pStyle w:val="Narracions"/>
         <w:rPr>
+          <w:sz w:val="22"/>
+          <w:szCs w:val="20"/>
+          <w:lang w:val="en-GB"/>
+        </w:rPr>
+      </w:pPr>
+      <w:r>
+        <w:rPr>
+          <w:sz w:val="22"/>
+          <w:szCs w:val="20"/>
+          <w:lang w:val="en-GB"/>
+        </w:rPr>
+        <w:t xml:space="preserve">In this project it will be assumed possible to train a model so that it shows a modicum of nuance in evaluating whether to </w:t>
+      </w:r>
+      <w:r>
+        <w:rPr>
+          <w:b/>
+          <w:bCs/>
+          <w:sz w:val="22"/>
+          <w:szCs w:val="20"/>
+          <w:lang w:val="en-GB"/>
+        </w:rPr>
+        <w:t>break an imperative law</w:t>
+      </w:r>
+      <w:r>
+        <w:rPr>
+          <w:sz w:val="22"/>
+          <w:szCs w:val="20"/>
+          <w:lang w:val="en-GB"/>
+        </w:rPr>
+        <w:t>.</w:t>
+      </w:r>
+      <w:r>
+        <w:t xml:space="preserve"> </w:t>
+      </w:r>
+      <w:r>
+        <w:rPr>
+          <w:sz w:val="22"/>
+          <w:szCs w:val="20"/>
+          <w:lang w:val="en-GB"/>
+        </w:rPr>
+        <w:t xml:space="preserve">As previously stated, the model should not incentivise breaking a positive law, but it might be </w:t>
+      </w:r>
+      <w:r>
+        <w:rPr>
+          <w:sz w:val="22"/>
+          <w:szCs w:val="20"/>
+          <w:lang w:val="en-GB"/>
+        </w:rPr>
+        <w:t>tasked</w:t>
+      </w:r>
+      <w:r>
+        <w:rPr>
+          <w:sz w:val="22"/>
+          <w:szCs w:val="20"/>
+          <w:lang w:val="en-GB"/>
+        </w:rPr>
+        <w:t xml:space="preserve"> </w:t>
+      </w:r>
+      <w:r>
+        <w:rPr>
+          <w:sz w:val="22"/>
+          <w:szCs w:val="20"/>
+          <w:lang w:val="en-GB"/>
+        </w:rPr>
+        <w:t>with</w:t>
+      </w:r>
+      <w:r>
+        <w:rPr>
+          <w:sz w:val="22"/>
+          <w:szCs w:val="20"/>
+          <w:lang w:val="en-GB"/>
+        </w:rPr>
+        <w:t xml:space="preserve"> prioritis</w:t>
+      </w:r>
+      <w:r>
+        <w:rPr>
+          <w:sz w:val="22"/>
+          <w:szCs w:val="20"/>
+          <w:lang w:val="en-GB"/>
+        </w:rPr>
+        <w:t>ing</w:t>
+      </w:r>
+      <w:r>
+        <w:rPr>
+          <w:sz w:val="22"/>
+          <w:szCs w:val="20"/>
+          <w:lang w:val="en-GB"/>
+        </w:rPr>
+        <w:t xml:space="preserve"> a moral law above another, thus breaking or overlooking the one that </w:t>
+      </w:r>
+      <w:r>
+        <w:rPr>
+          <w:sz w:val="22"/>
+          <w:szCs w:val="20"/>
+          <w:lang w:val="en-GB"/>
+        </w:rPr>
+        <w:t>is</w:t>
+      </w:r>
+      <w:r>
+        <w:rPr>
+          <w:sz w:val="22"/>
+          <w:szCs w:val="20"/>
+          <w:lang w:val="en-GB"/>
+        </w:rPr>
+        <w:t xml:space="preserve"> deem</w:t>
+      </w:r>
+      <w:r>
+        <w:rPr>
+          <w:sz w:val="22"/>
+          <w:szCs w:val="20"/>
+          <w:lang w:val="en-GB"/>
+        </w:rPr>
+        <w:t>ed</w:t>
+      </w:r>
+      <w:r>
+        <w:rPr>
+          <w:sz w:val="22"/>
+          <w:szCs w:val="20"/>
+          <w:lang w:val="en-GB"/>
+        </w:rPr>
+        <w:t xml:space="preserve"> less relevant. Conflicts such as this one can happen, for example, in moral objectivism.</w:t>
+      </w:r>
+    </w:p>
+    <w:p>
+      <w:pPr>
+        <w:pStyle w:val="Narracions"/>
+        <w:rPr>
           <w:i/>
           <w:iCs/>
           <w:sz w:val="22"/>
@@ -3316,17 +3658,7 @@
           <w:szCs w:val="20"/>
           <w:lang w:val="en-GB"/>
         </w:rPr>
-        <w:t xml:space="preserve">Is it relevant that a </w:t>
-      </w:r>
-      <w:r>
-        <w:rPr>
-          <w:i/>
-          <w:iCs/>
-          <w:sz w:val="22"/>
-          <w:szCs w:val="20"/>
-          <w:lang w:val="en-GB"/>
-        </w:rPr>
-        <w:t>law may be imperative in the model’s training?</w:t>
+        <w:t>Are all external sanctions relevant?</w:t>
       </w:r>
     </w:p>
     <w:p>
@@ -3358,23 +3690,7 @@
           <w:szCs w:val="20"/>
           <w:lang w:val="en-GB"/>
         </w:rPr>
-        <w:t xml:space="preserve">. It may be possible to train the model so that it shows a modicum of nuance in evaluating </w:t>
-      </w:r>
-      <w:r>
-        <w:rPr>
-          <w:sz w:val="22"/>
-          <w:szCs w:val="20"/>
-          <w:lang w:val="en-GB"/>
-        </w:rPr>
-        <w:t>whether</w:t>
-      </w:r>
-      <w:r>
-        <w:rPr>
-          <w:sz w:val="22"/>
-          <w:szCs w:val="20"/>
-          <w:lang w:val="en-GB"/>
-        </w:rPr>
-        <w:t xml:space="preserve"> to </w:t>
+        <w:t xml:space="preserve">. </w:t>
       </w:r>
       <w:r>
         <w:rPr>
@@ -3384,88 +3700,15 @@
           <w:szCs w:val="20"/>
           <w:lang w:val="en-GB"/>
         </w:rPr>
-        <w:t>break an imperative law</w:t>
-      </w:r>
-      <w:r>
-        <w:rPr>
-          <w:sz w:val="22"/>
-          <w:szCs w:val="20"/>
-          <w:lang w:val="en-GB"/>
-        </w:rPr>
-        <w:t xml:space="preserve">. </w:t>
-      </w:r>
-      <w:r>
-        <w:rPr>
-          <w:sz w:val="22"/>
-          <w:szCs w:val="20"/>
-          <w:lang w:val="en-GB"/>
-        </w:rPr>
-        <w:t xml:space="preserve">As previously stated, </w:t>
-      </w:r>
-      <w:r>
-        <w:rPr>
-          <w:sz w:val="22"/>
-          <w:szCs w:val="20"/>
-          <w:lang w:val="en-GB"/>
-        </w:rPr>
-        <w:t xml:space="preserve">the model should not incentivise breaking a positive law, but it might be asked to </w:t>
-      </w:r>
-      <w:r>
-        <w:rPr>
-          <w:b/>
-          <w:bCs/>
-          <w:sz w:val="22"/>
-          <w:szCs w:val="20"/>
-          <w:lang w:val="en-GB"/>
-        </w:rPr>
-        <w:t>prioritise a moral law</w:t>
-      </w:r>
-      <w:r>
-        <w:rPr>
-          <w:sz w:val="22"/>
-          <w:szCs w:val="20"/>
-          <w:lang w:val="en-GB"/>
-        </w:rPr>
-        <w:t xml:space="preserve"> above another, thus breaking or overlooking the </w:t>
-      </w:r>
-      <w:r>
-        <w:rPr>
-          <w:sz w:val="22"/>
-          <w:szCs w:val="20"/>
-          <w:lang w:val="en-GB"/>
-        </w:rPr>
-        <w:t xml:space="preserve">one that </w:t>
-      </w:r>
-      <w:r>
-        <w:rPr>
-          <w:sz w:val="22"/>
-          <w:szCs w:val="20"/>
-          <w:lang w:val="en-GB"/>
-        </w:rPr>
-        <w:lastRenderedPageBreak/>
-        <w:t>it deems less relevant. Conflicts such as this one can happen, for example, in moral objectivism.</w:t>
-      </w:r>
-    </w:p>
-    <w:p>
-      <w:pPr>
-        <w:pStyle w:val="Narracions"/>
-        <w:rPr>
-          <w:i/>
-          <w:iCs/>
-          <w:sz w:val="22"/>
-          <w:szCs w:val="20"/>
-          <w:lang w:val="en-GB"/>
-        </w:rPr>
-      </w:pPr>
-      <w:r>
-        <w:rPr>
-          <w:i/>
-          <w:iCs/>
-          <w:sz w:val="22"/>
-          <w:szCs w:val="20"/>
-          <w:lang w:val="en-GB"/>
-        </w:rPr>
-        <w:t>Are all external sanctions relevant?</w:t>
+        <w:t>Natural sanctions</w:t>
+      </w:r>
+      <w:r>
+        <w:rPr>
+          <w:sz w:val="22"/>
+          <w:szCs w:val="20"/>
+          <w:lang w:val="en-GB"/>
+        </w:rPr>
+        <w:t xml:space="preserve"> are, as with natural laws, to be assumed. Those consequences are axiomatic and ought to never be overlooked when providing a solution to a dilemma, as physical safety could be hindered, both the individual’s (moral agent) or anyone else involved.</w:t>
       </w:r>
     </w:p>
     <w:p>
@@ -3489,73 +3732,15 @@
           <w:szCs w:val="20"/>
           <w:lang w:val="en-GB"/>
         </w:rPr>
-        <w:t>Yes</w:t>
-      </w:r>
-      <w:r>
-        <w:rPr>
-          <w:sz w:val="22"/>
-          <w:szCs w:val="20"/>
-          <w:lang w:val="en-GB"/>
-        </w:rPr>
-        <w:t xml:space="preserve">. </w:t>
-      </w:r>
-      <w:r>
-        <w:rPr>
-          <w:b/>
-          <w:bCs/>
-          <w:sz w:val="22"/>
-          <w:szCs w:val="20"/>
-          <w:lang w:val="en-GB"/>
-        </w:rPr>
-        <w:t>Natural sanctions</w:t>
-      </w:r>
-      <w:r>
-        <w:rPr>
-          <w:sz w:val="22"/>
-          <w:szCs w:val="20"/>
-          <w:lang w:val="en-GB"/>
-        </w:rPr>
-        <w:t xml:space="preserve"> are, as with natural laws, to be assumed. </w:t>
-      </w:r>
-      <w:r>
-        <w:rPr>
-          <w:sz w:val="22"/>
-          <w:szCs w:val="20"/>
-          <w:lang w:val="en-GB"/>
-        </w:rPr>
-        <w:t xml:space="preserve">Those consequences are axiomatic and </w:t>
-      </w:r>
-      <w:r>
-        <w:rPr>
-          <w:sz w:val="22"/>
-          <w:szCs w:val="20"/>
-          <w:lang w:val="en-GB"/>
-        </w:rPr>
-        <w:t>ought to</w:t>
-      </w:r>
-      <w:r>
-        <w:rPr>
-          <w:sz w:val="22"/>
-          <w:szCs w:val="20"/>
-          <w:lang w:val="en-GB"/>
-        </w:rPr>
-        <w:t xml:space="preserve"> never be overlooked when providing a solution to a dilemma, as </w:t>
-      </w:r>
-      <w:r>
-        <w:rPr>
-          <w:sz w:val="22"/>
-          <w:szCs w:val="20"/>
-          <w:lang w:val="en-GB"/>
-        </w:rPr>
-        <w:t xml:space="preserve">physical safety could be hindered, both the individual’s (moral agent) or </w:t>
-      </w:r>
-      <w:r>
-        <w:rPr>
-          <w:sz w:val="22"/>
-          <w:szCs w:val="20"/>
-          <w:lang w:val="en-GB"/>
-        </w:rPr>
-        <w:t>anyone else involved.</w:t>
+        <w:t>Legal sanctions</w:t>
+      </w:r>
+      <w:r>
+        <w:rPr>
+          <w:sz w:val="22"/>
+          <w:szCs w:val="20"/>
+          <w:lang w:val="en-GB"/>
+        </w:rPr>
+        <w:t xml:space="preserve"> are the reason why positive laws should not be broken nor should illegal actions be incentivised. They must be considered before providing the final solution to the dilemma.</w:t>
       </w:r>
     </w:p>
     <w:p>
@@ -3579,47 +3764,37 @@
           <w:szCs w:val="20"/>
           <w:lang w:val="en-GB"/>
         </w:rPr>
-        <w:t>Legal sanctions</w:t>
-      </w:r>
-      <w:r>
-        <w:rPr>
-          <w:sz w:val="22"/>
-          <w:szCs w:val="20"/>
-          <w:lang w:val="en-GB"/>
-        </w:rPr>
-        <w:t xml:space="preserve"> are the reason why </w:t>
-      </w:r>
-      <w:r>
-        <w:rPr>
-          <w:sz w:val="22"/>
-          <w:szCs w:val="20"/>
-          <w:lang w:val="en-GB"/>
-        </w:rPr>
-        <w:t xml:space="preserve">positive laws should not be broken nor </w:t>
-      </w:r>
-      <w:r>
-        <w:rPr>
-          <w:sz w:val="22"/>
-          <w:szCs w:val="20"/>
-          <w:lang w:val="en-GB"/>
-        </w:rPr>
-        <w:t xml:space="preserve">should illegal </w:t>
-      </w:r>
-      <w:r>
-        <w:rPr>
-          <w:sz w:val="22"/>
-          <w:szCs w:val="20"/>
-          <w:lang w:val="en-GB"/>
-        </w:rPr>
-        <w:t xml:space="preserve">actions be incentivised. They must be considered before providing the final </w:t>
-      </w:r>
-      <w:r>
-        <w:rPr>
-          <w:sz w:val="22"/>
-          <w:szCs w:val="20"/>
-          <w:lang w:val="en-GB"/>
-        </w:rPr>
-        <w:t>solution to the dilemma.</w:t>
+        <w:t>Social sanctions</w:t>
+      </w:r>
+      <w:r>
+        <w:rPr>
+          <w:sz w:val="22"/>
+          <w:szCs w:val="20"/>
+          <w:lang w:val="en-GB"/>
+        </w:rPr>
+        <w:t xml:space="preserve"> are important both to prevent social unrest within the community the user will likely be a part of and considering the dilemmas will be quotidian scenes a person might encounter and solve organically.</w:t>
+      </w:r>
+    </w:p>
+    <w:p>
+      <w:pPr>
+        <w:pStyle w:val="Narracions"/>
+        <w:rPr>
+          <w:i/>
+          <w:iCs/>
+          <w:sz w:val="22"/>
+          <w:szCs w:val="20"/>
+          <w:lang w:val="en-GB"/>
+        </w:rPr>
+      </w:pPr>
+      <w:r>
+        <w:rPr>
+          <w:i/>
+          <w:iCs/>
+          <w:sz w:val="22"/>
+          <w:szCs w:val="20"/>
+          <w:lang w:val="en-GB"/>
+        </w:rPr>
+        <w:t>What schools of thought are most promising?</w:t>
       </w:r>
     </w:p>
     <w:p>
@@ -3637,53 +3812,29 @@
       </w:pPr>
       <w:r>
         <w:rPr>
-          <w:b/>
-          <w:bCs/>
-          <w:sz w:val="22"/>
-          <w:szCs w:val="20"/>
-          <w:lang w:val="en-GB"/>
-        </w:rPr>
-        <w:t>Social sanctions</w:t>
-      </w:r>
-      <w:r>
-        <w:rPr>
-          <w:sz w:val="22"/>
-          <w:szCs w:val="20"/>
-          <w:lang w:val="en-GB"/>
-        </w:rPr>
-        <w:t xml:space="preserve"> are important both to pre</w:t>
-      </w:r>
-      <w:r>
-        <w:rPr>
-          <w:sz w:val="22"/>
-          <w:szCs w:val="20"/>
-          <w:lang w:val="en-GB"/>
-        </w:rPr>
-        <w:t xml:space="preserve">vent social unrest within the community the user will likely be a part of and considering </w:t>
-      </w:r>
-      <w:r>
-        <w:rPr>
-          <w:sz w:val="22"/>
-          <w:szCs w:val="20"/>
-          <w:lang w:val="en-GB"/>
-        </w:rPr>
-        <w:t xml:space="preserve">the dilemmas will be quotidian </w:t>
-      </w:r>
-      <w:r>
-        <w:rPr>
-          <w:sz w:val="22"/>
-          <w:szCs w:val="20"/>
-          <w:lang w:val="en-GB"/>
-        </w:rPr>
-        <w:t>scenes a person might encounter and solve organically.</w:t>
+          <w:sz w:val="22"/>
+          <w:szCs w:val="20"/>
+          <w:lang w:val="en-GB"/>
+        </w:rPr>
+        <w:t>Moral objectivism and its ten laws</w:t>
+      </w:r>
+      <w:r>
+        <w:rPr>
+          <w:sz w:val="22"/>
+          <w:szCs w:val="20"/>
+          <w:lang w:val="en-GB"/>
+        </w:rPr>
+        <w:t>, without the tenth.</w:t>
       </w:r>
     </w:p>
     <w:p>
       <w:pPr>
         <w:pStyle w:val="Narracions"/>
-        <w:rPr>
-          <w:i/>
-          <w:iCs/>
+        <w:numPr>
+          <w:ilvl w:val="1"/>
+          <w:numId w:val="1"/>
+        </w:numPr>
+        <w:rPr>
           <w:sz w:val="22"/>
           <w:szCs w:val="20"/>
           <w:lang w:val="en-GB"/>
@@ -3691,33 +3842,11 @@
       </w:pPr>
       <w:r>
         <w:rPr>
-          <w:i/>
-          <w:iCs/>
-          <w:sz w:val="22"/>
-          <w:szCs w:val="20"/>
-          <w:lang w:val="en-GB"/>
-        </w:rPr>
-        <w:t>What schools of thought ar</w:t>
-      </w:r>
-      <w:r>
-        <w:rPr>
-          <w:i/>
-          <w:iCs/>
-          <w:sz w:val="22"/>
-          <w:szCs w:val="20"/>
-          <w:lang w:val="en-GB"/>
-        </w:rPr>
-        <w:t xml:space="preserve">e most </w:t>
-      </w:r>
-      <w:r>
-        <w:rPr>
-          <w:i/>
-          <w:iCs/>
-          <w:sz w:val="22"/>
-          <w:szCs w:val="20"/>
-          <w:lang w:val="en-GB"/>
-        </w:rPr>
-        <w:t>promising?</w:t>
+          <w:sz w:val="22"/>
+          <w:szCs w:val="20"/>
+          <w:lang w:val="en-GB"/>
+        </w:rPr>
+        <w:t>In AI, is this not the same as in absolutism? In that the rule is to follow until it cannot be followed, without ever breaking the tenth?</w:t>
       </w:r>
     </w:p>
     <w:p>
@@ -3739,33 +3868,15 @@
           <w:szCs w:val="20"/>
           <w:lang w:val="en-GB"/>
         </w:rPr>
-        <w:t xml:space="preserve">Moral objectivism and its ten </w:t>
-      </w:r>
-      <w:r>
-        <w:rPr>
-          <w:sz w:val="22"/>
-          <w:szCs w:val="20"/>
-          <w:lang w:val="en-GB"/>
-        </w:rPr>
-        <w:t>laws</w:t>
-      </w:r>
-      <w:r>
-        <w:rPr>
-          <w:sz w:val="22"/>
-          <w:szCs w:val="20"/>
-          <w:lang w:val="en-GB"/>
-        </w:rPr>
-        <w:t>, without the tenth.</w:t>
+        <w:t>Maybe moral realism, allotting moral value to suffering?</w:t>
       </w:r>
     </w:p>
     <w:p>
       <w:pPr>
         <w:pStyle w:val="Narracions"/>
-        <w:numPr>
-          <w:ilvl w:val="1"/>
-          <w:numId w:val="1"/>
-        </w:numPr>
-        <w:rPr>
+        <w:rPr>
+          <w:i/>
+          <w:iCs/>
           <w:sz w:val="22"/>
           <w:szCs w:val="20"/>
           <w:lang w:val="en-GB"/>
@@ -3773,22 +3884,14 @@
       </w:pPr>
       <w:r>
         <w:rPr>
-          <w:sz w:val="22"/>
-          <w:szCs w:val="20"/>
-          <w:lang w:val="en-GB"/>
-        </w:rPr>
-        <w:t xml:space="preserve">In AI, is this not the same as in absolutism? In that the rule is to follow until it cannot be followed, without ever breaking the </w:t>
-      </w:r>
-      <w:proofErr w:type="gramStart"/>
-      <w:r>
-        <w:rPr>
-          <w:sz w:val="22"/>
-          <w:szCs w:val="20"/>
-          <w:lang w:val="en-GB"/>
-        </w:rPr>
-        <w:t>tenth?</w:t>
-      </w:r>
-      <w:proofErr w:type="gramEnd"/>
+          <w:i/>
+          <w:iCs/>
+          <w:sz w:val="22"/>
+          <w:szCs w:val="20"/>
+          <w:lang w:val="en-GB"/>
+        </w:rPr>
+        <w:t>What schools of thought are least promising?</w:t>
+      </w:r>
     </w:p>
     <w:p>
       <w:pPr>
@@ -3809,37 +3912,7 @@
           <w:szCs w:val="20"/>
           <w:lang w:val="en-GB"/>
         </w:rPr>
-        <w:t xml:space="preserve">Maybe moral realism, allotting </w:t>
-      </w:r>
-      <w:r>
-        <w:rPr>
-          <w:sz w:val="22"/>
-          <w:szCs w:val="20"/>
-          <w:lang w:val="en-GB"/>
-        </w:rPr>
-        <w:t>moral value to suffering?</w:t>
-      </w:r>
-    </w:p>
-    <w:p>
-      <w:pPr>
-        <w:pStyle w:val="Narracions"/>
-        <w:rPr>
-          <w:i/>
-          <w:iCs/>
-          <w:sz w:val="22"/>
-          <w:szCs w:val="20"/>
-          <w:lang w:val="en-GB"/>
-        </w:rPr>
-      </w:pPr>
-      <w:r>
-        <w:rPr>
-          <w:i/>
-          <w:iCs/>
-          <w:sz w:val="22"/>
-          <w:szCs w:val="20"/>
-          <w:lang w:val="en-GB"/>
-        </w:rPr>
-        <w:t>What schools of thought are least promising?</w:t>
+        <w:t>Moral subjectivism, as it is based on the individual’s moral judgement.</w:t>
       </w:r>
     </w:p>
     <w:p>
@@ -3861,25 +3934,24 @@
           <w:szCs w:val="20"/>
           <w:lang w:val="en-GB"/>
         </w:rPr>
-        <w:t>Moral subjectivism</w:t>
-      </w:r>
-      <w:r>
-        <w:rPr>
-          <w:sz w:val="22"/>
-          <w:szCs w:val="20"/>
-          <w:lang w:val="en-GB"/>
-        </w:rPr>
-        <w:t>, as it is based on the individual’s moral judgement.</w:t>
+        <w:t>Maybe moral realism, considering its emphasis on values</w:t>
+      </w:r>
+      <w:r>
+        <w:rPr>
+          <w:sz w:val="22"/>
+          <w:szCs w:val="20"/>
+          <w:lang w:val="en-GB"/>
+        </w:rPr>
+        <w:t>.</w:t>
       </w:r>
     </w:p>
     <w:p>
       <w:pPr>
         <w:pStyle w:val="Narracions"/>
-        <w:numPr>
-          <w:ilvl w:val="0"/>
-          <w:numId w:val="1"/>
-        </w:numPr>
-        <w:rPr>
+        <w:shd w:val="clear" w:color="auto" w:fill="F2F2F2" w:themeFill="background1" w:themeFillShade="F2"/>
+        <w:rPr>
+          <w:b/>
+          <w:bCs/>
           <w:sz w:val="22"/>
           <w:szCs w:val="20"/>
           <w:lang w:val="en-GB"/>
@@ -3887,38 +3959,1331 @@
       </w:pPr>
       <w:r>
         <w:rPr>
-          <w:sz w:val="22"/>
-          <w:szCs w:val="20"/>
-          <w:lang w:val="en-GB"/>
-        </w:rPr>
-        <w:t xml:space="preserve">Maybe moral realism, </w:t>
-      </w:r>
-      <w:r>
-        <w:rPr>
-          <w:sz w:val="22"/>
-          <w:szCs w:val="20"/>
-          <w:lang w:val="en-GB"/>
-        </w:rPr>
-        <w:t xml:space="preserve">considering its emphasis on </w:t>
-      </w:r>
-      <w:r>
-        <w:rPr>
-          <w:sz w:val="22"/>
-          <w:szCs w:val="20"/>
-          <w:lang w:val="en-GB"/>
-        </w:rPr>
-        <w:t>values</w:t>
-      </w:r>
-      <w:r>
-        <w:rPr>
-          <w:sz w:val="22"/>
-          <w:szCs w:val="20"/>
-          <w:lang w:val="en-GB"/>
-        </w:rPr>
-        <w:t>.</w:t>
+          <w:b/>
+          <w:bCs/>
+          <w:sz w:val="22"/>
+          <w:szCs w:val="20"/>
+          <w:lang w:val="en-GB"/>
+        </w:rPr>
+        <w:lastRenderedPageBreak/>
+        <w:t>4</w:t>
+      </w:r>
+      <w:r>
+        <w:rPr>
+          <w:b/>
+          <w:bCs/>
+          <w:sz w:val="22"/>
+          <w:szCs w:val="20"/>
+          <w:lang w:val="en-GB"/>
+        </w:rPr>
+        <w:t>.1</w:t>
+      </w:r>
+      <w:r>
+        <w:rPr>
+          <w:b/>
+          <w:bCs/>
+          <w:sz w:val="22"/>
+          <w:szCs w:val="20"/>
+          <w:lang w:val="en-GB"/>
+        </w:rPr>
+        <w:tab/>
+      </w:r>
+      <w:r>
+        <w:rPr>
+          <w:b/>
+          <w:bCs/>
+          <w:sz w:val="22"/>
+          <w:szCs w:val="20"/>
+          <w:lang w:val="en-GB"/>
+        </w:rPr>
+        <w:t>First implementation</w:t>
+      </w:r>
+    </w:p>
+    <w:p>
+      <w:pPr>
+        <w:pStyle w:val="Narracions"/>
+        <w:rPr>
+          <w:sz w:val="22"/>
+          <w:szCs w:val="20"/>
+          <w:lang w:val="en-GB"/>
+        </w:rPr>
+      </w:pPr>
+      <w:r>
+        <w:rPr>
+          <w:sz w:val="22"/>
+          <w:szCs w:val="20"/>
+          <w:lang w:val="en-GB"/>
+        </w:rPr>
+        <w:t xml:space="preserve">The first implementation to be </w:t>
+      </w:r>
+      <w:r>
+        <w:rPr>
+          <w:sz w:val="22"/>
+          <w:szCs w:val="20"/>
+          <w:lang w:val="en-GB"/>
+        </w:rPr>
+        <w:t xml:space="preserve">applied to the model will revolve around </w:t>
+      </w:r>
+      <w:r>
+        <w:rPr>
+          <w:b/>
+          <w:bCs/>
+          <w:sz w:val="22"/>
+          <w:szCs w:val="20"/>
+          <w:lang w:val="en-GB"/>
+        </w:rPr>
+        <w:t>moral objectivism</w:t>
+      </w:r>
+      <w:r>
+        <w:rPr>
+          <w:sz w:val="22"/>
+          <w:szCs w:val="20"/>
+          <w:lang w:val="en-GB"/>
+        </w:rPr>
+        <w:t xml:space="preserve">. Specifically, </w:t>
+      </w:r>
+      <w:r>
+        <w:rPr>
+          <w:sz w:val="22"/>
+          <w:szCs w:val="20"/>
+          <w:lang w:val="en-GB"/>
+        </w:rPr>
+        <w:t xml:space="preserve">the </w:t>
+      </w:r>
+      <w:r>
+        <w:rPr>
+          <w:sz w:val="22"/>
+          <w:szCs w:val="20"/>
+          <w:lang w:val="en-GB"/>
+        </w:rPr>
+        <w:t>model will be given the following setup for its responses:</w:t>
+      </w:r>
+    </w:p>
+    <w:p>
+      <w:pPr>
+        <w:pStyle w:val="Narracions"/>
+        <w:spacing w:after="0" w:line="276" w:lineRule="auto"/>
+        <w:ind w:left="708"/>
+        <w:jc w:val="left"/>
+        <w:rPr>
+          <w:color w:val="A6A6A6" w:themeColor="background1" w:themeShade="A6"/>
+          <w:sz w:val="20"/>
+          <w:szCs w:val="18"/>
+          <w:lang w:val="en-GB"/>
+        </w:rPr>
+      </w:pPr>
+      <w:proofErr w:type="spellStart"/>
+      <w:r>
+        <w:rPr>
+          <w:color w:val="A6A6A6" w:themeColor="background1" w:themeShade="A6"/>
+          <w:sz w:val="20"/>
+          <w:szCs w:val="18"/>
+          <w:lang w:val="en-GB"/>
+        </w:rPr>
+        <w:t>reasoning_start</w:t>
+      </w:r>
+      <w:proofErr w:type="spellEnd"/>
+      <w:r>
+        <w:rPr>
+          <w:color w:val="A6A6A6" w:themeColor="background1" w:themeShade="A6"/>
+          <w:sz w:val="20"/>
+          <w:szCs w:val="18"/>
+          <w:lang w:val="en-GB"/>
+        </w:rPr>
+        <w:t xml:space="preserve"> = "&lt;think&gt;" </w:t>
+      </w:r>
+    </w:p>
+    <w:p>
+      <w:pPr>
+        <w:pStyle w:val="Narracions"/>
+        <w:spacing w:after="0" w:line="276" w:lineRule="auto"/>
+        <w:ind w:left="708"/>
+        <w:jc w:val="left"/>
+        <w:rPr>
+          <w:color w:val="A6A6A6" w:themeColor="background1" w:themeShade="A6"/>
+          <w:sz w:val="20"/>
+          <w:szCs w:val="18"/>
+          <w:lang w:val="en-GB"/>
+        </w:rPr>
+      </w:pPr>
+      <w:proofErr w:type="spellStart"/>
+      <w:r>
+        <w:rPr>
+          <w:color w:val="A6A6A6" w:themeColor="background1" w:themeShade="A6"/>
+          <w:sz w:val="20"/>
+          <w:szCs w:val="18"/>
+          <w:lang w:val="en-GB"/>
+        </w:rPr>
+        <w:t>reasoning_end</w:t>
+      </w:r>
+      <w:proofErr w:type="spellEnd"/>
+      <w:r>
+        <w:rPr>
+          <w:color w:val="A6A6A6" w:themeColor="background1" w:themeShade="A6"/>
+          <w:sz w:val="20"/>
+          <w:szCs w:val="18"/>
+          <w:lang w:val="en-GB"/>
+        </w:rPr>
+        <w:t xml:space="preserve">   = "&lt;/think&gt;" </w:t>
+      </w:r>
+    </w:p>
+    <w:p>
+      <w:pPr>
+        <w:pStyle w:val="Narracions"/>
+        <w:spacing w:after="0" w:line="276" w:lineRule="auto"/>
+        <w:ind w:left="708"/>
+        <w:jc w:val="left"/>
+        <w:rPr>
+          <w:color w:val="A6A6A6" w:themeColor="background1" w:themeShade="A6"/>
+          <w:sz w:val="20"/>
+          <w:szCs w:val="18"/>
+          <w:lang w:val="en-GB"/>
+        </w:rPr>
+      </w:pPr>
+      <w:proofErr w:type="spellStart"/>
+      <w:r>
+        <w:rPr>
+          <w:color w:val="A6A6A6" w:themeColor="background1" w:themeShade="A6"/>
+          <w:sz w:val="20"/>
+          <w:szCs w:val="18"/>
+          <w:lang w:val="en-GB"/>
+        </w:rPr>
+        <w:t>solution_start</w:t>
+      </w:r>
+      <w:proofErr w:type="spellEnd"/>
+      <w:r>
+        <w:rPr>
+          <w:color w:val="A6A6A6" w:themeColor="background1" w:themeShade="A6"/>
+          <w:sz w:val="20"/>
+          <w:szCs w:val="18"/>
+          <w:lang w:val="en-GB"/>
+        </w:rPr>
+        <w:t xml:space="preserve">  = "&lt;O&gt;"</w:t>
+      </w:r>
+    </w:p>
+    <w:p>
+      <w:pPr>
+        <w:pStyle w:val="Narracions"/>
+        <w:spacing w:after="0" w:line="276" w:lineRule="auto"/>
+        <w:ind w:left="708"/>
+        <w:jc w:val="left"/>
+        <w:rPr>
+          <w:color w:val="A6A6A6" w:themeColor="background1" w:themeShade="A6"/>
+          <w:sz w:val="20"/>
+          <w:szCs w:val="18"/>
+          <w:lang w:val="en-GB"/>
+        </w:rPr>
+      </w:pPr>
+      <w:proofErr w:type="spellStart"/>
+      <w:r>
+        <w:rPr>
+          <w:color w:val="A6A6A6" w:themeColor="background1" w:themeShade="A6"/>
+          <w:sz w:val="20"/>
+          <w:szCs w:val="18"/>
+          <w:lang w:val="en-GB"/>
+        </w:rPr>
+        <w:t>solution_end</w:t>
+      </w:r>
+      <w:proofErr w:type="spellEnd"/>
+      <w:r>
+        <w:rPr>
+          <w:color w:val="A6A6A6" w:themeColor="background1" w:themeShade="A6"/>
+          <w:sz w:val="20"/>
+          <w:szCs w:val="18"/>
+          <w:lang w:val="en-GB"/>
+        </w:rPr>
+        <w:t xml:space="preserve">    = "&lt;/O&gt;"</w:t>
+      </w:r>
+    </w:p>
+    <w:p>
+      <w:pPr>
+        <w:pStyle w:val="Narracions"/>
+        <w:spacing w:after="0" w:line="276" w:lineRule="auto"/>
+        <w:ind w:left="708"/>
+        <w:jc w:val="left"/>
+        <w:rPr>
+          <w:color w:val="A6A6A6" w:themeColor="background1" w:themeShade="A6"/>
+          <w:sz w:val="20"/>
+          <w:szCs w:val="18"/>
+          <w:lang w:val="en-GB"/>
+        </w:rPr>
+      </w:pPr>
+    </w:p>
+    <w:p>
+      <w:pPr>
+        <w:pStyle w:val="Narracions"/>
+        <w:spacing w:after="0" w:line="276" w:lineRule="auto"/>
+        <w:ind w:left="708"/>
+        <w:jc w:val="left"/>
+        <w:rPr>
+          <w:b/>
+          <w:bCs/>
+          <w:color w:val="A6A6A6" w:themeColor="background1" w:themeShade="A6"/>
+          <w:sz w:val="20"/>
+          <w:szCs w:val="18"/>
+          <w:lang w:val="en-GB"/>
+        </w:rPr>
+      </w:pPr>
+      <w:proofErr w:type="spellStart"/>
+      <w:r>
+        <w:rPr>
+          <w:color w:val="A6A6A6" w:themeColor="background1" w:themeShade="A6"/>
+          <w:sz w:val="20"/>
+          <w:szCs w:val="18"/>
+          <w:lang w:val="en-GB"/>
+        </w:rPr>
+        <w:t>system_prompt</w:t>
+      </w:r>
+      <w:proofErr w:type="spellEnd"/>
+      <w:r>
+        <w:rPr>
+          <w:color w:val="A6A6A6" w:themeColor="background1" w:themeShade="A6"/>
+          <w:sz w:val="20"/>
+          <w:szCs w:val="18"/>
+          <w:lang w:val="en-GB"/>
+        </w:rPr>
+        <w:t xml:space="preserve"> =   </w:t>
+      </w:r>
+      <w:proofErr w:type="spellStart"/>
+      <w:r>
+        <w:rPr>
+          <w:color w:val="A6A6A6" w:themeColor="background1" w:themeShade="A6"/>
+          <w:sz w:val="20"/>
+          <w:szCs w:val="18"/>
+          <w:lang w:val="en-GB"/>
+        </w:rPr>
+        <w:t>f"""</w:t>
+      </w:r>
+      <w:r>
+        <w:rPr>
+          <w:b/>
+          <w:bCs/>
+          <w:color w:val="A6A6A6" w:themeColor="background1" w:themeShade="A6"/>
+          <w:sz w:val="20"/>
+          <w:szCs w:val="18"/>
+          <w:lang w:val="en-GB"/>
+        </w:rPr>
+        <w:t>You</w:t>
+      </w:r>
+      <w:proofErr w:type="spellEnd"/>
+      <w:r>
+        <w:rPr>
+          <w:b/>
+          <w:bCs/>
+          <w:color w:val="A6A6A6" w:themeColor="background1" w:themeShade="A6"/>
+          <w:sz w:val="20"/>
+          <w:szCs w:val="18"/>
+          <w:lang w:val="en-GB"/>
+        </w:rPr>
+        <w:t xml:space="preserve"> are a helpful assistant.</w:t>
+      </w:r>
+    </w:p>
+    <w:p>
+      <w:pPr>
+        <w:pStyle w:val="Narracions"/>
+        <w:spacing w:after="0" w:line="276" w:lineRule="auto"/>
+        <w:ind w:left="708"/>
+        <w:jc w:val="left"/>
+        <w:rPr>
+          <w:b/>
+          <w:bCs/>
+          <w:color w:val="A6A6A6" w:themeColor="background1" w:themeShade="A6"/>
+          <w:sz w:val="20"/>
+          <w:szCs w:val="18"/>
+          <w:lang w:val="en-GB"/>
+        </w:rPr>
+      </w:pPr>
+      <w:r>
+        <w:rPr>
+          <w:b/>
+          <w:bCs/>
+          <w:color w:val="A6A6A6" w:themeColor="background1" w:themeShade="A6"/>
+          <w:sz w:val="20"/>
+          <w:szCs w:val="18"/>
+          <w:lang w:val="en-GB"/>
+        </w:rPr>
+        <w:t>You are given a situation needing a moral solution.</w:t>
+      </w:r>
+    </w:p>
+    <w:p>
+      <w:pPr>
+        <w:pStyle w:val="Narracions"/>
+        <w:spacing w:after="0" w:line="276" w:lineRule="auto"/>
+        <w:ind w:left="708"/>
+        <w:jc w:val="left"/>
+        <w:rPr>
+          <w:b/>
+          <w:bCs/>
+          <w:color w:val="A6A6A6" w:themeColor="background1" w:themeShade="A6"/>
+          <w:sz w:val="20"/>
+          <w:szCs w:val="18"/>
+          <w:lang w:val="en-GB"/>
+        </w:rPr>
+      </w:pPr>
+      <w:r>
+        <w:rPr>
+          <w:b/>
+          <w:bCs/>
+          <w:color w:val="A6A6A6" w:themeColor="background1" w:themeShade="A6"/>
+          <w:sz w:val="20"/>
+          <w:szCs w:val="18"/>
+          <w:lang w:val="en-GB"/>
+        </w:rPr>
+        <w:t>You must reason a moral solution and determine whether the narrator is behaving correctly according to moral reasoning.</w:t>
+      </w:r>
+    </w:p>
+    <w:p>
+      <w:pPr>
+        <w:pStyle w:val="Narracions"/>
+        <w:spacing w:after="0" w:line="276" w:lineRule="auto"/>
+        <w:ind w:left="708"/>
+        <w:jc w:val="left"/>
+        <w:rPr>
+          <w:b/>
+          <w:bCs/>
+          <w:color w:val="A6A6A6" w:themeColor="background1" w:themeShade="A6"/>
+          <w:sz w:val="20"/>
+          <w:szCs w:val="18"/>
+          <w:lang w:val="en-GB"/>
+        </w:rPr>
+      </w:pPr>
+      <w:r>
+        <w:rPr>
+          <w:b/>
+          <w:bCs/>
+          <w:color w:val="A6A6A6" w:themeColor="background1" w:themeShade="A6"/>
+          <w:sz w:val="20"/>
+          <w:szCs w:val="18"/>
+          <w:lang w:val="en-GB"/>
+        </w:rPr>
+        <w:t>You must take into consideration these moral axioms, which are to be prioritised from top (1), with maximum priority, to bottom (10):</w:t>
+      </w:r>
+    </w:p>
+    <w:p>
+      <w:pPr>
+        <w:pStyle w:val="Narracions"/>
+        <w:spacing w:after="0" w:line="276" w:lineRule="auto"/>
+        <w:ind w:left="708"/>
+        <w:jc w:val="left"/>
+        <w:rPr>
+          <w:b/>
+          <w:bCs/>
+          <w:color w:val="A6A6A6" w:themeColor="background1" w:themeShade="A6"/>
+          <w:sz w:val="20"/>
+          <w:szCs w:val="18"/>
+          <w:lang w:val="en-GB"/>
+        </w:rPr>
+      </w:pPr>
+      <w:r>
+        <w:rPr>
+          <w:b/>
+          <w:bCs/>
+          <w:color w:val="A6A6A6" w:themeColor="background1" w:themeShade="A6"/>
+          <w:sz w:val="20"/>
+          <w:szCs w:val="18"/>
+          <w:lang w:val="en-GB"/>
+        </w:rPr>
+        <w:t>1.</w:t>
+      </w:r>
+      <w:r>
+        <w:rPr>
+          <w:b/>
+          <w:bCs/>
+          <w:color w:val="A6A6A6" w:themeColor="background1" w:themeShade="A6"/>
+          <w:sz w:val="20"/>
+          <w:szCs w:val="18"/>
+          <w:lang w:val="en-GB"/>
+        </w:rPr>
+        <w:tab/>
+        <w:t>To not kill innocent people.</w:t>
+      </w:r>
+    </w:p>
+    <w:p>
+      <w:pPr>
+        <w:pStyle w:val="Narracions"/>
+        <w:spacing w:after="0" w:line="276" w:lineRule="auto"/>
+        <w:ind w:left="708"/>
+        <w:jc w:val="left"/>
+        <w:rPr>
+          <w:b/>
+          <w:bCs/>
+          <w:color w:val="A6A6A6" w:themeColor="background1" w:themeShade="A6"/>
+          <w:sz w:val="20"/>
+          <w:szCs w:val="18"/>
+          <w:lang w:val="en-GB"/>
+        </w:rPr>
+      </w:pPr>
+      <w:r>
+        <w:rPr>
+          <w:b/>
+          <w:bCs/>
+          <w:color w:val="A6A6A6" w:themeColor="background1" w:themeShade="A6"/>
+          <w:sz w:val="20"/>
+          <w:szCs w:val="18"/>
+          <w:lang w:val="en-GB"/>
+        </w:rPr>
+        <w:t>2.</w:t>
+      </w:r>
+      <w:r>
+        <w:rPr>
+          <w:b/>
+          <w:bCs/>
+          <w:color w:val="A6A6A6" w:themeColor="background1" w:themeShade="A6"/>
+          <w:sz w:val="20"/>
+          <w:szCs w:val="18"/>
+          <w:lang w:val="en-GB"/>
+        </w:rPr>
+        <w:tab/>
+        <w:t>To not cause unnecessary harm nor suffering.</w:t>
+      </w:r>
+    </w:p>
+    <w:p>
+      <w:pPr>
+        <w:pStyle w:val="Narracions"/>
+        <w:spacing w:after="0" w:line="276" w:lineRule="auto"/>
+        <w:ind w:left="708"/>
+        <w:jc w:val="left"/>
+        <w:rPr>
+          <w:b/>
+          <w:bCs/>
+          <w:color w:val="A6A6A6" w:themeColor="background1" w:themeShade="A6"/>
+          <w:sz w:val="20"/>
+          <w:szCs w:val="18"/>
+          <w:lang w:val="en-GB"/>
+        </w:rPr>
+      </w:pPr>
+      <w:r>
+        <w:rPr>
+          <w:b/>
+          <w:bCs/>
+          <w:color w:val="A6A6A6" w:themeColor="background1" w:themeShade="A6"/>
+          <w:sz w:val="20"/>
+          <w:szCs w:val="18"/>
+          <w:lang w:val="en-GB"/>
+        </w:rPr>
+        <w:t>3.</w:t>
+      </w:r>
+      <w:r>
+        <w:rPr>
+          <w:b/>
+          <w:bCs/>
+          <w:color w:val="A6A6A6" w:themeColor="background1" w:themeShade="A6"/>
+          <w:sz w:val="20"/>
+          <w:szCs w:val="18"/>
+          <w:lang w:val="en-GB"/>
+        </w:rPr>
+        <w:tab/>
+        <w:t>To not deceive nor steal.</w:t>
+      </w:r>
+    </w:p>
+    <w:p>
+      <w:pPr>
+        <w:pStyle w:val="Narracions"/>
+        <w:spacing w:after="0" w:line="276" w:lineRule="auto"/>
+        <w:ind w:left="708"/>
+        <w:jc w:val="left"/>
+        <w:rPr>
+          <w:b/>
+          <w:bCs/>
+          <w:color w:val="A6A6A6" w:themeColor="background1" w:themeShade="A6"/>
+          <w:sz w:val="20"/>
+          <w:szCs w:val="18"/>
+          <w:lang w:val="en-GB"/>
+        </w:rPr>
+      </w:pPr>
+      <w:r>
+        <w:rPr>
+          <w:b/>
+          <w:bCs/>
+          <w:color w:val="A6A6A6" w:themeColor="background1" w:themeShade="A6"/>
+          <w:sz w:val="20"/>
+          <w:szCs w:val="18"/>
+          <w:lang w:val="en-GB"/>
+        </w:rPr>
+        <w:t>4.</w:t>
+      </w:r>
+      <w:r>
+        <w:rPr>
+          <w:b/>
+          <w:bCs/>
+          <w:color w:val="A6A6A6" w:themeColor="background1" w:themeShade="A6"/>
+          <w:sz w:val="20"/>
+          <w:szCs w:val="18"/>
+          <w:lang w:val="en-GB"/>
+        </w:rPr>
+        <w:tab/>
+        <w:t>To comply with promises and honour one's agreements.</w:t>
+      </w:r>
+    </w:p>
+    <w:p>
+      <w:pPr>
+        <w:pStyle w:val="Narracions"/>
+        <w:spacing w:after="0" w:line="276" w:lineRule="auto"/>
+        <w:ind w:left="708"/>
+        <w:jc w:val="left"/>
+        <w:rPr>
+          <w:b/>
+          <w:bCs/>
+          <w:color w:val="A6A6A6" w:themeColor="background1" w:themeShade="A6"/>
+          <w:sz w:val="20"/>
+          <w:szCs w:val="18"/>
+          <w:lang w:val="en-GB"/>
+        </w:rPr>
+      </w:pPr>
+      <w:r>
+        <w:rPr>
+          <w:b/>
+          <w:bCs/>
+          <w:color w:val="A6A6A6" w:themeColor="background1" w:themeShade="A6"/>
+          <w:sz w:val="20"/>
+          <w:szCs w:val="18"/>
+          <w:lang w:val="en-GB"/>
+        </w:rPr>
+        <w:t>5.</w:t>
+      </w:r>
+      <w:r>
+        <w:rPr>
+          <w:b/>
+          <w:bCs/>
+          <w:color w:val="A6A6A6" w:themeColor="background1" w:themeShade="A6"/>
+          <w:sz w:val="20"/>
+          <w:szCs w:val="18"/>
+          <w:lang w:val="en-GB"/>
+        </w:rPr>
+        <w:tab/>
+        <w:t>To not deprive anyone from freedom.</w:t>
+      </w:r>
+    </w:p>
+    <w:p>
+      <w:pPr>
+        <w:pStyle w:val="Narracions"/>
+        <w:spacing w:after="0" w:line="276" w:lineRule="auto"/>
+        <w:ind w:left="708"/>
+        <w:jc w:val="left"/>
+        <w:rPr>
+          <w:b/>
+          <w:bCs/>
+          <w:color w:val="A6A6A6" w:themeColor="background1" w:themeShade="A6"/>
+          <w:sz w:val="20"/>
+          <w:szCs w:val="18"/>
+          <w:lang w:val="en-GB"/>
+        </w:rPr>
+      </w:pPr>
+      <w:r>
+        <w:rPr>
+          <w:b/>
+          <w:bCs/>
+          <w:color w:val="A6A6A6" w:themeColor="background1" w:themeShade="A6"/>
+          <w:sz w:val="20"/>
+          <w:szCs w:val="18"/>
+          <w:lang w:val="en-GB"/>
+        </w:rPr>
+        <w:t>6.</w:t>
+      </w:r>
+      <w:r>
+        <w:rPr>
+          <w:b/>
+          <w:bCs/>
+          <w:color w:val="A6A6A6" w:themeColor="background1" w:themeShade="A6"/>
+          <w:sz w:val="20"/>
+          <w:szCs w:val="18"/>
+          <w:lang w:val="en-GB"/>
+        </w:rPr>
+        <w:tab/>
+        <w:t>To act justly.</w:t>
+      </w:r>
+    </w:p>
+    <w:p>
+      <w:pPr>
+        <w:pStyle w:val="Narracions"/>
+        <w:spacing w:after="0" w:line="276" w:lineRule="auto"/>
+        <w:ind w:left="708"/>
+        <w:jc w:val="left"/>
+        <w:rPr>
+          <w:b/>
+          <w:bCs/>
+          <w:color w:val="A6A6A6" w:themeColor="background1" w:themeShade="A6"/>
+          <w:sz w:val="20"/>
+          <w:szCs w:val="18"/>
+          <w:lang w:val="en-GB"/>
+        </w:rPr>
+      </w:pPr>
+      <w:r>
+        <w:rPr>
+          <w:b/>
+          <w:bCs/>
+          <w:color w:val="A6A6A6" w:themeColor="background1" w:themeShade="A6"/>
+          <w:sz w:val="20"/>
+          <w:szCs w:val="18"/>
+          <w:lang w:val="en-GB"/>
+        </w:rPr>
+        <w:t>7.</w:t>
+      </w:r>
+      <w:r>
+        <w:rPr>
+          <w:b/>
+          <w:bCs/>
+          <w:color w:val="A6A6A6" w:themeColor="background1" w:themeShade="A6"/>
+          <w:sz w:val="20"/>
+          <w:szCs w:val="18"/>
+          <w:lang w:val="en-GB"/>
+        </w:rPr>
+        <w:tab/>
+        <w:t>To be truthful.</w:t>
+      </w:r>
+    </w:p>
+    <w:p>
+      <w:pPr>
+        <w:pStyle w:val="Narracions"/>
+        <w:spacing w:after="0" w:line="276" w:lineRule="auto"/>
+        <w:ind w:left="708"/>
+        <w:jc w:val="left"/>
+        <w:rPr>
+          <w:b/>
+          <w:bCs/>
+          <w:color w:val="A6A6A6" w:themeColor="background1" w:themeShade="A6"/>
+          <w:sz w:val="20"/>
+          <w:szCs w:val="18"/>
+          <w:lang w:val="en-GB"/>
+        </w:rPr>
+      </w:pPr>
+      <w:r>
+        <w:rPr>
+          <w:b/>
+          <w:bCs/>
+          <w:color w:val="A6A6A6" w:themeColor="background1" w:themeShade="A6"/>
+          <w:sz w:val="20"/>
+          <w:szCs w:val="18"/>
+          <w:lang w:val="en-GB"/>
+        </w:rPr>
+        <w:t>8.</w:t>
+      </w:r>
+      <w:r>
+        <w:rPr>
+          <w:b/>
+          <w:bCs/>
+          <w:color w:val="A6A6A6" w:themeColor="background1" w:themeShade="A6"/>
+          <w:sz w:val="20"/>
+          <w:szCs w:val="18"/>
+          <w:lang w:val="en-GB"/>
+        </w:rPr>
+        <w:tab/>
+        <w:t>To help others.</w:t>
+      </w:r>
+    </w:p>
+    <w:p>
+      <w:pPr>
+        <w:pStyle w:val="Narracions"/>
+        <w:spacing w:after="0" w:line="276" w:lineRule="auto"/>
+        <w:ind w:left="708"/>
+        <w:jc w:val="left"/>
+        <w:rPr>
+          <w:b/>
+          <w:bCs/>
+          <w:color w:val="A6A6A6" w:themeColor="background1" w:themeShade="A6"/>
+          <w:sz w:val="20"/>
+          <w:szCs w:val="18"/>
+          <w:lang w:val="en-GB"/>
+        </w:rPr>
+      </w:pPr>
+      <w:r>
+        <w:rPr>
+          <w:b/>
+          <w:bCs/>
+          <w:color w:val="A6A6A6" w:themeColor="background1" w:themeShade="A6"/>
+          <w:sz w:val="20"/>
+          <w:szCs w:val="18"/>
+          <w:lang w:val="en-GB"/>
+        </w:rPr>
+        <w:t>9.</w:t>
+      </w:r>
+      <w:r>
+        <w:rPr>
+          <w:b/>
+          <w:bCs/>
+          <w:color w:val="A6A6A6" w:themeColor="background1" w:themeShade="A6"/>
+          <w:sz w:val="20"/>
+          <w:szCs w:val="18"/>
+          <w:lang w:val="en-GB"/>
+        </w:rPr>
+        <w:tab/>
+        <w:t>To be grateful.</w:t>
+      </w:r>
+    </w:p>
+    <w:p>
+      <w:pPr>
+        <w:pStyle w:val="Narracions"/>
+        <w:spacing w:after="0" w:line="276" w:lineRule="auto"/>
+        <w:ind w:left="708"/>
+        <w:jc w:val="left"/>
+        <w:rPr>
+          <w:b/>
+          <w:bCs/>
+          <w:color w:val="A6A6A6" w:themeColor="background1" w:themeShade="A6"/>
+          <w:sz w:val="20"/>
+          <w:szCs w:val="18"/>
+          <w:lang w:val="en-GB"/>
+        </w:rPr>
+      </w:pPr>
+      <w:r>
+        <w:rPr>
+          <w:b/>
+          <w:bCs/>
+          <w:color w:val="A6A6A6" w:themeColor="background1" w:themeShade="A6"/>
+          <w:sz w:val="20"/>
+          <w:szCs w:val="18"/>
+          <w:lang w:val="en-GB"/>
+        </w:rPr>
+        <w:t>10.</w:t>
+      </w:r>
+      <w:r>
+        <w:rPr>
+          <w:b/>
+          <w:bCs/>
+          <w:color w:val="A6A6A6" w:themeColor="background1" w:themeShade="A6"/>
+          <w:sz w:val="20"/>
+          <w:szCs w:val="18"/>
+          <w:lang w:val="en-GB"/>
+        </w:rPr>
+        <w:tab/>
+        <w:t>To obey positive laws that are just.</w:t>
+      </w:r>
+    </w:p>
+    <w:p>
+      <w:pPr>
+        <w:pStyle w:val="Narracions"/>
+        <w:spacing w:after="0" w:line="276" w:lineRule="auto"/>
+        <w:ind w:left="708"/>
+        <w:jc w:val="left"/>
+        <w:rPr>
+          <w:b/>
+          <w:bCs/>
+          <w:color w:val="A6A6A6" w:themeColor="background1" w:themeShade="A6"/>
+          <w:sz w:val="20"/>
+          <w:szCs w:val="18"/>
+          <w:lang w:val="en-GB"/>
+        </w:rPr>
+      </w:pPr>
+      <w:r>
+        <w:rPr>
+          <w:b/>
+          <w:bCs/>
+          <w:color w:val="A6A6A6" w:themeColor="background1" w:themeShade="A6"/>
+          <w:sz w:val="20"/>
+          <w:szCs w:val="18"/>
+          <w:lang w:val="en-GB"/>
+        </w:rPr>
+        <w:t xml:space="preserve">You must </w:t>
+      </w:r>
+      <w:r>
+        <w:rPr>
+          <w:b/>
+          <w:bCs/>
+          <w:color w:val="A6A6A6" w:themeColor="background1" w:themeShade="A6"/>
+          <w:sz w:val="20"/>
+          <w:szCs w:val="18"/>
+          <w:lang w:val="en-GB"/>
+        </w:rPr>
+        <w:t>accommodate</w:t>
+      </w:r>
+      <w:r>
+        <w:rPr>
+          <w:b/>
+          <w:bCs/>
+          <w:color w:val="A6A6A6" w:themeColor="background1" w:themeShade="A6"/>
+          <w:sz w:val="20"/>
+          <w:szCs w:val="18"/>
+          <w:lang w:val="en-GB"/>
+        </w:rPr>
+        <w:t xml:space="preserve"> as many axioms as possible and justify each axiom you do not.</w:t>
+      </w:r>
+    </w:p>
+    <w:p>
+      <w:pPr>
+        <w:pStyle w:val="Narracions"/>
+        <w:spacing w:after="0" w:line="276" w:lineRule="auto"/>
+        <w:ind w:left="708"/>
+        <w:jc w:val="left"/>
+        <w:rPr>
+          <w:b/>
+          <w:bCs/>
+          <w:color w:val="A6A6A6" w:themeColor="background1" w:themeShade="A6"/>
+          <w:sz w:val="20"/>
+          <w:szCs w:val="18"/>
+          <w:lang w:val="en-GB"/>
+        </w:rPr>
+      </w:pPr>
+      <w:r>
+        <w:rPr>
+          <w:b/>
+          <w:bCs/>
+          <w:color w:val="A6A6A6" w:themeColor="background1" w:themeShade="A6"/>
+          <w:sz w:val="20"/>
+          <w:szCs w:val="18"/>
+          <w:lang w:val="en-GB"/>
+        </w:rPr>
+        <w:t>Then determine whether the narrator is behaving correctly according to this moral reasoning.</w:t>
+      </w:r>
+    </w:p>
+    <w:p>
+      <w:pPr>
+        <w:pStyle w:val="Narracions"/>
+        <w:spacing w:after="0" w:line="276" w:lineRule="auto"/>
+        <w:ind w:left="708"/>
+        <w:jc w:val="left"/>
+        <w:rPr>
+          <w:b/>
+          <w:bCs/>
+          <w:color w:val="A6A6A6" w:themeColor="background1" w:themeShade="A6"/>
+          <w:sz w:val="20"/>
+          <w:szCs w:val="18"/>
+          <w:lang w:val="en-GB"/>
+        </w:rPr>
+      </w:pPr>
+      <w:r>
+        <w:rPr>
+          <w:b/>
+          <w:bCs/>
+          <w:color w:val="A6A6A6" w:themeColor="background1" w:themeShade="A6"/>
+          <w:sz w:val="20"/>
+          <w:szCs w:val="18"/>
+          <w:lang w:val="en-GB"/>
+        </w:rPr>
+        <w:t>Place your reasoning between {</w:t>
+      </w:r>
+      <w:proofErr w:type="spellStart"/>
+      <w:r>
+        <w:rPr>
+          <w:b/>
+          <w:bCs/>
+          <w:color w:val="A6A6A6" w:themeColor="background1" w:themeShade="A6"/>
+          <w:sz w:val="20"/>
+          <w:szCs w:val="18"/>
+          <w:lang w:val="en-GB"/>
+        </w:rPr>
+        <w:t>reasoning_start</w:t>
+      </w:r>
+      <w:proofErr w:type="spellEnd"/>
+      <w:r>
+        <w:rPr>
+          <w:b/>
+          <w:bCs/>
+          <w:color w:val="A6A6A6" w:themeColor="background1" w:themeShade="A6"/>
+          <w:sz w:val="20"/>
+          <w:szCs w:val="18"/>
+          <w:lang w:val="en-GB"/>
+        </w:rPr>
+        <w:t>} and {</w:t>
+      </w:r>
+      <w:proofErr w:type="spellStart"/>
+      <w:r>
+        <w:rPr>
+          <w:b/>
+          <w:bCs/>
+          <w:color w:val="A6A6A6" w:themeColor="background1" w:themeShade="A6"/>
+          <w:sz w:val="20"/>
+          <w:szCs w:val="18"/>
+          <w:lang w:val="en-GB"/>
+        </w:rPr>
+        <w:t>reasoning_end</w:t>
+      </w:r>
+      <w:proofErr w:type="spellEnd"/>
+      <w:r>
+        <w:rPr>
+          <w:b/>
+          <w:bCs/>
+          <w:color w:val="A6A6A6" w:themeColor="background1" w:themeShade="A6"/>
+          <w:sz w:val="20"/>
+          <w:szCs w:val="18"/>
+          <w:lang w:val="en-GB"/>
+        </w:rPr>
+        <w:t>}.</w:t>
+      </w:r>
+    </w:p>
+    <w:p>
+      <w:pPr>
+        <w:pStyle w:val="Narracions"/>
+        <w:spacing w:after="0" w:line="276" w:lineRule="auto"/>
+        <w:ind w:left="708"/>
+        <w:jc w:val="left"/>
+        <w:rPr>
+          <w:b/>
+          <w:bCs/>
+          <w:color w:val="A6A6A6" w:themeColor="background1" w:themeShade="A6"/>
+          <w:sz w:val="20"/>
+          <w:szCs w:val="18"/>
+          <w:lang w:val="en-GB"/>
+        </w:rPr>
+      </w:pPr>
+      <w:r>
+        <w:rPr>
+          <w:b/>
+          <w:bCs/>
+          <w:color w:val="A6A6A6" w:themeColor="background1" w:themeShade="A6"/>
+          <w:sz w:val="20"/>
+          <w:szCs w:val="18"/>
+          <w:lang w:val="en-GB"/>
+        </w:rPr>
+        <w:t>Then, provide your answer "RIGHT" or "WRONG" within {</w:t>
+      </w:r>
+      <w:proofErr w:type="spellStart"/>
+      <w:r>
+        <w:rPr>
+          <w:b/>
+          <w:bCs/>
+          <w:color w:val="A6A6A6" w:themeColor="background1" w:themeShade="A6"/>
+          <w:sz w:val="20"/>
+          <w:szCs w:val="18"/>
+          <w:lang w:val="en-GB"/>
+        </w:rPr>
+        <w:t>solution_start</w:t>
+      </w:r>
+      <w:proofErr w:type="spellEnd"/>
+      <w:r>
+        <w:rPr>
+          <w:b/>
+          <w:bCs/>
+          <w:color w:val="A6A6A6" w:themeColor="background1" w:themeShade="A6"/>
+          <w:sz w:val="20"/>
+          <w:szCs w:val="18"/>
+          <w:lang w:val="en-GB"/>
+        </w:rPr>
+        <w:t>} and {</w:t>
+      </w:r>
+      <w:proofErr w:type="spellStart"/>
+      <w:r>
+        <w:rPr>
+          <w:b/>
+          <w:bCs/>
+          <w:color w:val="A6A6A6" w:themeColor="background1" w:themeShade="A6"/>
+          <w:sz w:val="20"/>
+          <w:szCs w:val="18"/>
+          <w:lang w:val="en-GB"/>
+        </w:rPr>
+        <w:t>solution_end</w:t>
+      </w:r>
+      <w:proofErr w:type="spellEnd"/>
+      <w:r>
+        <w:rPr>
+          <w:b/>
+          <w:bCs/>
+          <w:color w:val="A6A6A6" w:themeColor="background1" w:themeShade="A6"/>
+          <w:sz w:val="20"/>
+          <w:szCs w:val="18"/>
+          <w:lang w:val="en-GB"/>
+        </w:rPr>
+        <w:t>} as the final verdict.</w:t>
+      </w:r>
+    </w:p>
+    <w:p>
+      <w:pPr>
+        <w:pStyle w:val="Narracions"/>
+        <w:ind w:left="708"/>
+        <w:rPr>
+          <w:color w:val="A6A6A6" w:themeColor="background1" w:themeShade="A6"/>
+          <w:sz w:val="20"/>
+          <w:szCs w:val="18"/>
+          <w:lang w:val="en-GB"/>
+        </w:rPr>
+      </w:pPr>
+      <w:r>
+        <w:rPr>
+          <w:color w:val="A6A6A6" w:themeColor="background1" w:themeShade="A6"/>
+          <w:sz w:val="20"/>
+          <w:szCs w:val="18"/>
+          <w:lang w:val="en-GB"/>
+        </w:rPr>
+        <w:t>"""</w:t>
+      </w:r>
+    </w:p>
+    <w:p>
+      <w:pPr>
+        <w:pStyle w:val="Narracions"/>
+        <w:rPr>
+          <w:sz w:val="22"/>
+          <w:szCs w:val="20"/>
+          <w:lang w:val="en-GB"/>
+        </w:rPr>
+      </w:pPr>
+      <w:r>
+        <w:rPr>
+          <w:sz w:val="22"/>
+          <w:szCs w:val="20"/>
+          <w:lang w:val="en-GB"/>
+        </w:rPr>
+        <w:t>…</w:t>
+      </w:r>
+    </w:p>
+    <w:p>
+      <w:pPr>
+        <w:pStyle w:val="Narracions"/>
+        <w:shd w:val="clear" w:color="auto" w:fill="E7E6E6" w:themeFill="background2"/>
+        <w:rPr>
+          <w:b/>
+          <w:bCs/>
+          <w:sz w:val="22"/>
+          <w:szCs w:val="20"/>
+          <w:lang w:val="en-GB"/>
+        </w:rPr>
+      </w:pPr>
+      <w:r>
+        <w:rPr>
+          <w:b/>
+          <w:bCs/>
+          <w:sz w:val="22"/>
+          <w:szCs w:val="20"/>
+          <w:lang w:val="en-GB"/>
+        </w:rPr>
+        <w:t>5</w:t>
+      </w:r>
+      <w:r>
+        <w:rPr>
+          <w:b/>
+          <w:bCs/>
+          <w:sz w:val="22"/>
+          <w:szCs w:val="20"/>
+          <w:lang w:val="en-GB"/>
+        </w:rPr>
+        <w:tab/>
+      </w:r>
+      <w:r>
+        <w:rPr>
+          <w:b/>
+          <w:bCs/>
+          <w:sz w:val="22"/>
+          <w:szCs w:val="20"/>
+          <w:lang w:val="en-GB"/>
+        </w:rPr>
+        <w:t>Limitations</w:t>
+      </w:r>
+    </w:p>
+    <w:p>
+      <w:pPr>
+        <w:pStyle w:val="Narracions"/>
+        <w:rPr>
+          <w:sz w:val="22"/>
+          <w:szCs w:val="20"/>
+          <w:lang w:val="en-GB"/>
+        </w:rPr>
+      </w:pPr>
+      <w:r>
+        <w:rPr>
+          <w:sz w:val="22"/>
+          <w:szCs w:val="20"/>
+          <w:lang w:val="en-GB"/>
+        </w:rPr>
+        <w:t xml:space="preserve">As previously stated, the </w:t>
+      </w:r>
+      <w:r>
+        <w:rPr>
+          <w:b/>
+          <w:bCs/>
+          <w:sz w:val="22"/>
+          <w:szCs w:val="20"/>
+          <w:lang w:val="en-GB"/>
+        </w:rPr>
+        <w:t>timespan</w:t>
+      </w:r>
+      <w:r>
+        <w:rPr>
+          <w:sz w:val="22"/>
+          <w:szCs w:val="20"/>
+          <w:lang w:val="en-GB"/>
+        </w:rPr>
+        <w:t xml:space="preserve"> for this project is </w:t>
+      </w:r>
+      <w:r>
+        <w:rPr>
+          <w:sz w:val="22"/>
+          <w:szCs w:val="20"/>
+          <w:lang w:val="en-GB"/>
+        </w:rPr>
+        <w:t xml:space="preserve">limited to a few months. This limits its scope, given that it will not be possible to make a thorough assessment of all possible moral implementations that could be tried out. It </w:t>
+      </w:r>
+      <w:r>
+        <w:rPr>
+          <w:sz w:val="22"/>
+          <w:szCs w:val="20"/>
+          <w:lang w:val="en-GB"/>
+        </w:rPr>
+        <w:t xml:space="preserve">also shortens the available time to provide a study for the results of the implementations that will be </w:t>
+      </w:r>
+      <w:r>
+        <w:rPr>
+          <w:sz w:val="22"/>
+          <w:szCs w:val="20"/>
+          <w:lang w:val="en-GB"/>
+        </w:rPr>
+        <w:t>experimented with.</w:t>
+      </w:r>
+    </w:p>
+    <w:p>
+      <w:pPr>
+        <w:pStyle w:val="Narracions"/>
+        <w:rPr>
+          <w:sz w:val="22"/>
+          <w:szCs w:val="20"/>
+          <w:lang w:val="en-GB"/>
+        </w:rPr>
+      </w:pPr>
+      <w:r>
+        <w:rPr>
+          <w:sz w:val="22"/>
+          <w:szCs w:val="20"/>
+          <w:lang w:val="en-GB"/>
+        </w:rPr>
+        <w:t>One must never forget that the model being used is a pre-trained</w:t>
+      </w:r>
+      <w:r>
+        <w:rPr>
+          <w:sz w:val="22"/>
+          <w:szCs w:val="20"/>
+          <w:lang w:val="en-GB"/>
+        </w:rPr>
+        <w:t xml:space="preserve"> model</w:t>
+      </w:r>
+      <w:r>
+        <w:rPr>
+          <w:sz w:val="22"/>
+          <w:szCs w:val="20"/>
+          <w:lang w:val="en-GB"/>
+        </w:rPr>
+        <w:t xml:space="preserve">, </w:t>
+      </w:r>
+      <w:r>
+        <w:rPr>
+          <w:sz w:val="22"/>
+          <w:szCs w:val="20"/>
+          <w:lang w:val="en-GB"/>
+        </w:rPr>
+        <w:t xml:space="preserve">with its behaviour </w:t>
+      </w:r>
+      <w:r>
+        <w:rPr>
+          <w:sz w:val="22"/>
+          <w:szCs w:val="20"/>
+          <w:lang w:val="en-GB"/>
+        </w:rPr>
+        <w:t>filtered out</w:t>
+      </w:r>
+      <w:r>
+        <w:rPr>
+          <w:sz w:val="22"/>
+          <w:szCs w:val="20"/>
+          <w:lang w:val="en-GB"/>
+        </w:rPr>
+        <w:t xml:space="preserve"> for our purposes</w:t>
+      </w:r>
+      <w:r>
+        <w:rPr>
+          <w:sz w:val="22"/>
+          <w:szCs w:val="20"/>
+          <w:lang w:val="en-GB"/>
+        </w:rPr>
+        <w:t>. This model is, in turn</w:t>
+      </w:r>
+      <w:r>
+        <w:rPr>
+          <w:sz w:val="22"/>
+          <w:szCs w:val="20"/>
+          <w:lang w:val="en-GB"/>
+        </w:rPr>
+        <w:t>,</w:t>
+      </w:r>
+      <w:r>
+        <w:rPr>
+          <w:sz w:val="22"/>
+          <w:szCs w:val="20"/>
+          <w:lang w:val="en-GB"/>
+        </w:rPr>
+        <w:t xml:space="preserve"> a </w:t>
+      </w:r>
+      <w:r>
+        <w:rPr>
+          <w:b/>
+          <w:bCs/>
+          <w:sz w:val="22"/>
+          <w:szCs w:val="20"/>
+          <w:lang w:val="en-GB"/>
+        </w:rPr>
+        <w:t>product</w:t>
+      </w:r>
+      <w:r>
+        <w:rPr>
+          <w:sz w:val="22"/>
+          <w:szCs w:val="20"/>
+          <w:lang w:val="en-GB"/>
+        </w:rPr>
+        <w:t xml:space="preserve">. As such, there are certain concerns </w:t>
+      </w:r>
+      <w:r>
+        <w:rPr>
+          <w:sz w:val="22"/>
+          <w:szCs w:val="20"/>
+          <w:lang w:val="en-GB"/>
+        </w:rPr>
+        <w:t>for</w:t>
+      </w:r>
+      <w:r>
+        <w:rPr>
+          <w:sz w:val="22"/>
+          <w:szCs w:val="20"/>
+          <w:lang w:val="en-GB"/>
+        </w:rPr>
+        <w:t xml:space="preserve"> liability </w:t>
+      </w:r>
+      <w:r>
+        <w:rPr>
+          <w:sz w:val="22"/>
+          <w:szCs w:val="20"/>
+          <w:lang w:val="en-GB"/>
+        </w:rPr>
+        <w:t xml:space="preserve">that have already been addressed by the provider of </w:t>
+      </w:r>
+      <w:r>
+        <w:rPr>
+          <w:sz w:val="22"/>
+          <w:szCs w:val="20"/>
+          <w:lang w:val="en-GB"/>
+        </w:rPr>
+        <w:t xml:space="preserve">such service. The decisions made during the actual training of the model are beyond the scope of this project, albeit it might </w:t>
+      </w:r>
+      <w:r>
+        <w:rPr>
+          <w:sz w:val="22"/>
+          <w:szCs w:val="20"/>
+          <w:lang w:val="en-GB"/>
+        </w:rPr>
+        <w:t xml:space="preserve">profoundly affect its results. We cannot know what </w:t>
+      </w:r>
+      <w:r>
+        <w:rPr>
+          <w:sz w:val="22"/>
+          <w:szCs w:val="20"/>
+          <w:lang w:val="en-GB"/>
+        </w:rPr>
+        <w:lastRenderedPageBreak/>
+        <w:t xml:space="preserve">parameters or hardcoded considerations were implemented during its initial setup, but </w:t>
+      </w:r>
+      <w:r>
+        <w:rPr>
+          <w:sz w:val="22"/>
+          <w:szCs w:val="20"/>
+          <w:lang w:val="en-GB"/>
+        </w:rPr>
+        <w:t xml:space="preserve">it is most probable that some provisions in the way it answers and analyses problems, as well </w:t>
+      </w:r>
+      <w:r>
+        <w:rPr>
+          <w:sz w:val="22"/>
+          <w:szCs w:val="20"/>
+          <w:lang w:val="en-GB"/>
+        </w:rPr>
+        <w:t xml:space="preserve">how it interacts with positive laws or the rules of society, have been </w:t>
       </w:r>
     </w:p>
     <w:sectPr>
+      <w:footerReference w:type="default" r:id="rId18"/>
       <w:pgSz w:w="11906" w:h="16838"/>
       <w:pgMar w:top="1417" w:right="1701" w:bottom="1417" w:left="1701" w:header="708" w:footer="708" w:gutter="0"/>
       <w:cols w:space="708"/>
@@ -3951,6 +5316,84 @@
     </w:p>
   </w:endnote>
 </w:endnotes>
+</file>
+
+<file path=word/footer1.xml><?xml version="1.0" encoding="utf-8"?>
+<w:ftr xmlns:wpc="http://schemas.microsoft.com/office/word/2010/wordprocessingCanvas" xmlns:cx="http://schemas.microsoft.com/office/drawing/2014/chartex" xmlns:cx1="http://schemas.microsoft.com/office/drawing/2015/9/8/chartex" xmlns:cx2="http://schemas.microsoft.com/office/drawing/2015/10/21/chartex" xmlns:cx3="http://schemas.microsoft.com/office/drawing/2016/5/9/chartex" xmlns:cx4="http://schemas.microsoft.com/office/drawing/2016/5/10/chartex" xmlns:cx5="http://schemas.microsoft.com/office/drawing/2016/5/11/chartex" xmlns:cx6="http://schemas.microsoft.com/office/drawing/2016/5/12/chartex" xmlns:cx7="http://schemas.microsoft.com/office/drawing/2016/5/13/chartex" xmlns:cx8="http://schemas.microsoft.com/office/drawing/2016/5/14/chartex" xmlns:mc="http://schemas.openxmlformats.org/markup-compatibility/2006" xmlns:aink="http://schemas.microsoft.com/office/drawing/2016/ink" xmlns:am3d="http://schemas.microsoft.com/office/drawing/2017/model3d" xmlns:o="urn:schemas-microsoft-com:office:office" xmlns:oel="http://schemas.microsoft.com/office/2019/extlst" xmlns:r="http://schemas.openxmlformats.org/officeDocument/2006/relationships" xmlns:m="http://schemas.openxmlformats.org/officeDocument/2006/math" xmlns:v="urn:schemas-microsoft-com:vml" xmlns:wp14="http://schemas.microsoft.com/office/word/2010/wordprocessingDrawing" xmlns:wp="http://schemas.openxmlformats.org/drawingml/2006/wordprocessingDrawing" xmlns:w10="urn:schemas-microsoft-com:office:word" xmlns:w="http://schemas.openxmlformats.org/wordprocessingml/2006/main" xmlns:w14="http://schemas.microsoft.com/office/word/2010/wordml" xmlns:w15="http://schemas.microsoft.com/office/word/2012/wordml" xmlns:w16cex="http://schemas.microsoft.com/office/word/2018/wordml/cex" xmlns:w16cid="http://schemas.microsoft.com/office/word/2016/wordml/cid" xmlns:w16="http://schemas.microsoft.com/office/word/2018/wordml" xmlns:w16du="http://schemas.microsoft.com/office/word/2023/wordml/word16du" xmlns:w16sdtdh="http://schemas.microsoft.com/office/word/2020/wordml/sdtdatahash" xmlns:w16sdtfl="http://schemas.microsoft.com/office/word/2024/wordml/sdtformatlock" xmlns:w16se="http://schemas.microsoft.com/office/word/2015/wordml/symex" xmlns:wpg="http://schemas.microsoft.com/office/word/2010/wordprocessingGroup" xmlns:wpi="http://schemas.microsoft.com/office/word/2010/wordprocessingInk" xmlns:wne="http://schemas.microsoft.com/office/word/2006/wordml" xmlns:wps="http://schemas.microsoft.com/office/word/2010/wordprocessingShape" mc:Ignorable="w14 w15 w16se w16cid w16 w16cex w16sdtdh w16sdtfl w16du wp14">
+  <w:sdt>
+    <w:sdtPr>
+      <w:rPr>
+        <w:rFonts w:ascii="Arial" w:hAnsi="Arial" w:cs="Arial"/>
+        <w:sz w:val="20"/>
+        <w:szCs w:val="20"/>
+      </w:rPr>
+      <w:id w:val="1774971220"/>
+      <w:docPartObj>
+        <w:docPartGallery w:val="Page Numbers (Bottom of Page)"/>
+        <w:docPartUnique/>
+      </w:docPartObj>
+    </w:sdtPr>
+    <w:sdtEndPr>
+      <w:rPr>
+        <w:sz w:val="18"/>
+        <w:szCs w:val="18"/>
+      </w:rPr>
+    </w:sdtEndPr>
+    <w:sdtContent>
+      <w:p>
+        <w:pPr>
+          <w:pStyle w:val="Footer"/>
+          <w:jc w:val="center"/>
+          <w:rPr>
+            <w:rFonts w:ascii="Arial" w:hAnsi="Arial" w:cs="Arial"/>
+            <w:sz w:val="18"/>
+            <w:szCs w:val="18"/>
+          </w:rPr>
+        </w:pPr>
+        <w:r>
+          <w:rPr>
+            <w:rFonts w:ascii="Arial" w:hAnsi="Arial" w:cs="Arial"/>
+            <w:sz w:val="18"/>
+            <w:szCs w:val="18"/>
+          </w:rPr>
+          <w:fldChar w:fldCharType="begin"/>
+        </w:r>
+        <w:r>
+          <w:rPr>
+            <w:rFonts w:ascii="Arial" w:hAnsi="Arial" w:cs="Arial"/>
+            <w:sz w:val="18"/>
+            <w:szCs w:val="18"/>
+          </w:rPr>
+          <w:instrText>PAGE   \* MERGEFORMAT</w:instrText>
+        </w:r>
+        <w:r>
+          <w:rPr>
+            <w:rFonts w:ascii="Arial" w:hAnsi="Arial" w:cs="Arial"/>
+            <w:sz w:val="18"/>
+            <w:szCs w:val="18"/>
+          </w:rPr>
+          <w:fldChar w:fldCharType="separate"/>
+        </w:r>
+        <w:r>
+          <w:rPr>
+            <w:rFonts w:ascii="Arial" w:hAnsi="Arial" w:cs="Arial"/>
+            <w:sz w:val="18"/>
+            <w:szCs w:val="18"/>
+          </w:rPr>
+          <w:t>2</w:t>
+        </w:r>
+        <w:r>
+          <w:rPr>
+            <w:rFonts w:ascii="Arial" w:hAnsi="Arial" w:cs="Arial"/>
+            <w:sz w:val="18"/>
+            <w:szCs w:val="18"/>
+          </w:rPr>
+          <w:fldChar w:fldCharType="end"/>
+        </w:r>
+      </w:p>
+    </w:sdtContent>
+  </w:sdt>
+</w:ftr>
 </file>
 
 <file path=word/footnotes.xml><?xml version="1.0" encoding="utf-8"?>
@@ -4250,6 +5693,119 @@
     </w:lvl>
   </w:abstractNum>
   <w:abstractNum w:abstractNumId="2" w15:restartNumberingAfterBreak="0">
+    <w:nsid w:val="18B512A1"/>
+    <w:multiLevelType w:val="hybridMultilevel"/>
+    <w:tmpl w:val="CB2ABE7E"/>
+    <w:lvl w:ilvl="0" w:tplc="7C264032">
+      <w:start w:val="4"/>
+      <w:numFmt w:val="bullet"/>
+      <w:lvlText w:val="-"/>
+      <w:lvlJc w:val="left"/>
+      <w:pPr>
+        <w:ind w:left="720" w:hanging="360"/>
+      </w:pPr>
+      <w:rPr>
+        <w:rFonts w:ascii="Arial" w:eastAsiaTheme="minorHAnsi" w:hAnsi="Arial" w:cs="Arial" w:hint="default"/>
+      </w:rPr>
+    </w:lvl>
+    <w:lvl w:ilvl="1" w:tplc="04030003" w:tentative="1">
+      <w:start w:val="1"/>
+      <w:numFmt w:val="bullet"/>
+      <w:lvlText w:val="o"/>
+      <w:lvlJc w:val="left"/>
+      <w:pPr>
+        <w:ind w:left="1440" w:hanging="360"/>
+      </w:pPr>
+      <w:rPr>
+        <w:rFonts w:ascii="Courier New" w:hAnsi="Courier New" w:cs="Courier New" w:hint="default"/>
+      </w:rPr>
+    </w:lvl>
+    <w:lvl w:ilvl="2" w:tplc="04030005" w:tentative="1">
+      <w:start w:val="1"/>
+      <w:numFmt w:val="bullet"/>
+      <w:lvlText w:val=""/>
+      <w:lvlJc w:val="left"/>
+      <w:pPr>
+        <w:ind w:left="2160" w:hanging="360"/>
+      </w:pPr>
+      <w:rPr>
+        <w:rFonts w:ascii="Wingdings" w:hAnsi="Wingdings" w:hint="default"/>
+      </w:rPr>
+    </w:lvl>
+    <w:lvl w:ilvl="3" w:tplc="04030001" w:tentative="1">
+      <w:start w:val="1"/>
+      <w:numFmt w:val="bullet"/>
+      <w:lvlText w:val=""/>
+      <w:lvlJc w:val="left"/>
+      <w:pPr>
+        <w:ind w:left="2880" w:hanging="360"/>
+      </w:pPr>
+      <w:rPr>
+        <w:rFonts w:ascii="Symbol" w:hAnsi="Symbol" w:hint="default"/>
+      </w:rPr>
+    </w:lvl>
+    <w:lvl w:ilvl="4" w:tplc="04030003" w:tentative="1">
+      <w:start w:val="1"/>
+      <w:numFmt w:val="bullet"/>
+      <w:lvlText w:val="o"/>
+      <w:lvlJc w:val="left"/>
+      <w:pPr>
+        <w:ind w:left="3600" w:hanging="360"/>
+      </w:pPr>
+      <w:rPr>
+        <w:rFonts w:ascii="Courier New" w:hAnsi="Courier New" w:cs="Courier New" w:hint="default"/>
+      </w:rPr>
+    </w:lvl>
+    <w:lvl w:ilvl="5" w:tplc="04030005" w:tentative="1">
+      <w:start w:val="1"/>
+      <w:numFmt w:val="bullet"/>
+      <w:lvlText w:val=""/>
+      <w:lvlJc w:val="left"/>
+      <w:pPr>
+        <w:ind w:left="4320" w:hanging="360"/>
+      </w:pPr>
+      <w:rPr>
+        <w:rFonts w:ascii="Wingdings" w:hAnsi="Wingdings" w:hint="default"/>
+      </w:rPr>
+    </w:lvl>
+    <w:lvl w:ilvl="6" w:tplc="04030001" w:tentative="1">
+      <w:start w:val="1"/>
+      <w:numFmt w:val="bullet"/>
+      <w:lvlText w:val=""/>
+      <w:lvlJc w:val="left"/>
+      <w:pPr>
+        <w:ind w:left="5040" w:hanging="360"/>
+      </w:pPr>
+      <w:rPr>
+        <w:rFonts w:ascii="Symbol" w:hAnsi="Symbol" w:hint="default"/>
+      </w:rPr>
+    </w:lvl>
+    <w:lvl w:ilvl="7" w:tplc="04030003" w:tentative="1">
+      <w:start w:val="1"/>
+      <w:numFmt w:val="bullet"/>
+      <w:lvlText w:val="o"/>
+      <w:lvlJc w:val="left"/>
+      <w:pPr>
+        <w:ind w:left="5760" w:hanging="360"/>
+      </w:pPr>
+      <w:rPr>
+        <w:rFonts w:ascii="Courier New" w:hAnsi="Courier New" w:cs="Courier New" w:hint="default"/>
+      </w:rPr>
+    </w:lvl>
+    <w:lvl w:ilvl="8" w:tplc="04030005" w:tentative="1">
+      <w:start w:val="1"/>
+      <w:numFmt w:val="bullet"/>
+      <w:lvlText w:val=""/>
+      <w:lvlJc w:val="left"/>
+      <w:pPr>
+        <w:ind w:left="6480" w:hanging="360"/>
+      </w:pPr>
+      <w:rPr>
+        <w:rFonts w:ascii="Wingdings" w:hAnsi="Wingdings" w:hint="default"/>
+      </w:rPr>
+    </w:lvl>
+  </w:abstractNum>
+  <w:abstractNum w:abstractNumId="3" w15:restartNumberingAfterBreak="0">
     <w:nsid w:val="366E487A"/>
     <w:multiLevelType w:val="hybridMultilevel"/>
     <w:tmpl w:val="F492153E"/>
@@ -4347,6 +5903,9 @@
     <w:abstractNumId w:val="0"/>
   </w:num>
   <w:num w:numId="3" w16cid:durableId="2138445626">
+    <w:abstractNumId w:val="3"/>
+  </w:num>
+  <w:num w:numId="4" w16cid:durableId="449780794">
     <w:abstractNumId w:val="2"/>
   </w:num>
 </w:numbering>
@@ -5374,6 +6933,50 @@
     <w:rPr>
       <w:vertAlign w:val="superscript"/>
     </w:rPr>
+  </w:style>
+  <w:style w:type="paragraph" w:styleId="Header">
+    <w:name w:val="header"/>
+    <w:basedOn w:val="Normal"/>
+    <w:link w:val="HeaderChar"/>
+    <w:uiPriority w:val="99"/>
+    <w:unhideWhenUsed/>
+    <w:rsid w:val="002D0E09"/>
+    <w:pPr>
+      <w:tabs>
+        <w:tab w:val="center" w:pos="4252"/>
+        <w:tab w:val="right" w:pos="8504"/>
+      </w:tabs>
+      <w:spacing w:after="0" w:line="240" w:lineRule="auto"/>
+    </w:pPr>
+  </w:style>
+  <w:style w:type="character" w:customStyle="1" w:styleId="HeaderChar">
+    <w:name w:val="Header Char"/>
+    <w:basedOn w:val="DefaultParagraphFont"/>
+    <w:link w:val="Header"/>
+    <w:uiPriority w:val="99"/>
+    <w:rsid w:val="002D0E09"/>
+  </w:style>
+  <w:style w:type="paragraph" w:styleId="Footer">
+    <w:name w:val="footer"/>
+    <w:basedOn w:val="Normal"/>
+    <w:link w:val="FooterChar"/>
+    <w:uiPriority w:val="99"/>
+    <w:unhideWhenUsed/>
+    <w:rsid w:val="002D0E09"/>
+    <w:pPr>
+      <w:tabs>
+        <w:tab w:val="center" w:pos="4252"/>
+        <w:tab w:val="right" w:pos="8504"/>
+      </w:tabs>
+      <w:spacing w:after="0" w:line="240" w:lineRule="auto"/>
+    </w:pPr>
+  </w:style>
+  <w:style w:type="character" w:customStyle="1" w:styleId="FooterChar">
+    <w:name w:val="Footer Char"/>
+    <w:basedOn w:val="DefaultParagraphFont"/>
+    <w:link w:val="Footer"/>
+    <w:uiPriority w:val="99"/>
+    <w:rsid w:val="002D0E09"/>
   </w:style>
 </w:styles>
 </file>

</xml_diff>